<commit_message>
updated the executive summary
</commit_message>
<xml_diff>
--- a/M-CSC005U1 Group Project Template.docx
+++ b/M-CSC005U1 Group Project Template.docx
@@ -1,6 +1,6 @@
 
 <file path=word/document.xml><?xml version="1.0" encoding="utf-8"?>
-<w:document xmlns:wpc="http://schemas.microsoft.com/office/word/2010/wordprocessingCanvas" xmlns:cx="http://schemas.microsoft.com/office/drawing/2014/chartex" xmlns:cx1="http://schemas.microsoft.com/office/drawing/2015/9/8/chartex" xmlns:mc="http://schemas.openxmlformats.org/markup-compatibility/2006" xmlns:o="urn:schemas-microsoft-com:office:office" xmlns:r="http://schemas.openxmlformats.org/officeDocument/2006/relationships" xmlns:m="http://schemas.openxmlformats.org/officeDocument/2006/math" xmlns:v="urn:schemas-microsoft-com:vml" xmlns:wp14="http://schemas.microsoft.com/office/word/2010/wordprocessingDrawing" xmlns:wp="http://schemas.openxmlformats.org/drawingml/2006/wordprocessingDrawing" xmlns:w10="urn:schemas-microsoft-com:office:word" xmlns:w="http://schemas.openxmlformats.org/wordprocessingml/2006/main" xmlns:w14="http://schemas.microsoft.com/office/word/2010/wordml" xmlns:w15="http://schemas.microsoft.com/office/word/2012/wordml" xmlns:w16se="http://schemas.microsoft.com/office/word/2015/wordml/symex" xmlns:wpg="http://schemas.microsoft.com/office/word/2010/wordprocessingGroup" xmlns:wpi="http://schemas.microsoft.com/office/word/2010/wordprocessingInk" xmlns:wne="http://schemas.microsoft.com/office/word/2006/wordml" xmlns:wps="http://schemas.microsoft.com/office/word/2010/wordprocessingShape" mc:Ignorable="w14 w15 w16se wp14">
+<w:document xmlns:wpc="http://schemas.microsoft.com/office/word/2010/wordprocessingCanvas" xmlns:cx="http://schemas.microsoft.com/office/drawing/2014/chartex" xmlns:cx1="http://schemas.microsoft.com/office/drawing/2015/9/8/chartex" xmlns:cx2="http://schemas.microsoft.com/office/drawing/2015/10/21/chartex" xmlns:cx3="http://schemas.microsoft.com/office/drawing/2016/5/9/chartex" xmlns:cx4="http://schemas.microsoft.com/office/drawing/2016/5/10/chartex" xmlns:cx5="http://schemas.microsoft.com/office/drawing/2016/5/11/chartex" xmlns:cx6="http://schemas.microsoft.com/office/drawing/2016/5/12/chartex" xmlns:cx7="http://schemas.microsoft.com/office/drawing/2016/5/13/chartex" xmlns:cx8="http://schemas.microsoft.com/office/drawing/2016/5/14/chartex" xmlns:mc="http://schemas.openxmlformats.org/markup-compatibility/2006" xmlns:aink="http://schemas.microsoft.com/office/drawing/2016/ink" xmlns:am3d="http://schemas.microsoft.com/office/drawing/2017/model3d" xmlns:o="urn:schemas-microsoft-com:office:office" xmlns:oel="http://schemas.microsoft.com/office/2019/extlst" xmlns:r="http://schemas.openxmlformats.org/officeDocument/2006/relationships" xmlns:m="http://schemas.openxmlformats.org/officeDocument/2006/math" xmlns:v="urn:schemas-microsoft-com:vml" xmlns:wp14="http://schemas.microsoft.com/office/word/2010/wordprocessingDrawing" xmlns:wp="http://schemas.openxmlformats.org/drawingml/2006/wordprocessingDrawing" xmlns:w10="urn:schemas-microsoft-com:office:word" xmlns:w="http://schemas.openxmlformats.org/wordprocessingml/2006/main" xmlns:w14="http://schemas.microsoft.com/office/word/2010/wordml" xmlns:w15="http://schemas.microsoft.com/office/word/2012/wordml" xmlns:w16cex="http://schemas.microsoft.com/office/word/2018/wordml/cex" xmlns:w16cid="http://schemas.microsoft.com/office/word/2016/wordml/cid" xmlns:w16="http://schemas.microsoft.com/office/word/2018/wordml" xmlns:w16du="http://schemas.microsoft.com/office/word/2023/wordml/word16du" xmlns:w16sdtdh="http://schemas.microsoft.com/office/word/2020/wordml/sdtdatahash" xmlns:w16sdtfl="http://schemas.microsoft.com/office/word/2024/wordml/sdtformatlock" xmlns:w16se="http://schemas.microsoft.com/office/word/2015/wordml/symex" xmlns:wpg="http://schemas.microsoft.com/office/word/2010/wordprocessingGroup" xmlns:wpi="http://schemas.microsoft.com/office/word/2010/wordprocessingInk" xmlns:wne="http://schemas.microsoft.com/office/word/2006/wordml" xmlns:wps="http://schemas.microsoft.com/office/word/2010/wordprocessingShape" mc:Ignorable="w14 w15 w16se w16cid w16 w16cex w16sdtdh w16sdtfl w16du wp14">
   <w:body>
     <w:p>
       <w:pPr>
@@ -16,7 +16,7 @@
           <w:sz w:val="18"/>
           <w:szCs w:val="18"/>
         </w:rPr>
-        <w:t>M-</w:t>
+        <w:t>M-CSC005U</w:t>
       </w:r>
       <w:proofErr w:type="gramStart"/>
       <w:r>
@@ -25,7 +25,7 @@
           <w:sz w:val="18"/>
           <w:szCs w:val="18"/>
         </w:rPr>
-        <w:t>CSC005U1  ·</w:t>
+        <w:t>1  ·</w:t>
       </w:r>
       <w:proofErr w:type="gramEnd"/>
       <w:r>
@@ -34,7 +34,25 @@
           <w:sz w:val="18"/>
           <w:szCs w:val="18"/>
         </w:rPr>
-        <w:t xml:space="preserve">  Computational Mathematics and Data Analytics  ·  Level 4</w:t>
+        <w:t xml:space="preserve">  Computational Mathematics and Data </w:t>
+      </w:r>
+      <w:proofErr w:type="gramStart"/>
+      <w:r>
+        <w:rPr>
+          <w:color w:val="000000" w:themeColor="text1"/>
+          <w:sz w:val="18"/>
+          <w:szCs w:val="18"/>
+        </w:rPr>
+        <w:t>Analytics  ·</w:t>
+      </w:r>
+      <w:proofErr w:type="gramEnd"/>
+      <w:r>
+        <w:rPr>
+          <w:color w:val="000000" w:themeColor="text1"/>
+          <w:sz w:val="18"/>
+          <w:szCs w:val="18"/>
+        </w:rPr>
+        <w:t xml:space="preserve">  Level 4</w:t>
       </w:r>
     </w:p>
     <w:p>
@@ -94,7 +112,7 @@
           <w:iCs/>
           <w:color w:val="000000" w:themeColor="text1"/>
         </w:rPr>
-        <w:t>Group Project (Coursework</w:t>
+        <w:t>Group Project (</w:t>
       </w:r>
       <w:proofErr w:type="gramStart"/>
       <w:r>
@@ -103,7 +121,7 @@
           <w:iCs/>
           <w:color w:val="000000" w:themeColor="text1"/>
         </w:rPr>
-        <w:t>)  —</w:t>
+        <w:t>Coursework)  —</w:t>
       </w:r>
       <w:proofErr w:type="gramEnd"/>
       <w:r>
@@ -112,7 +130,25 @@
           <w:iCs/>
           <w:color w:val="000000" w:themeColor="text1"/>
         </w:rPr>
-        <w:t xml:space="preserve">  Assessment 1  (60% of module)</w:t>
+        <w:t xml:space="preserve">  Assessment </w:t>
+      </w:r>
+      <w:proofErr w:type="gramStart"/>
+      <w:r>
+        <w:rPr>
+          <w:i/>
+          <w:iCs/>
+          <w:color w:val="000000" w:themeColor="text1"/>
+        </w:rPr>
+        <w:t>1  (</w:t>
+      </w:r>
+      <w:proofErr w:type="gramEnd"/>
+      <w:r>
+        <w:rPr>
+          <w:i/>
+          <w:iCs/>
+          <w:color w:val="000000" w:themeColor="text1"/>
+        </w:rPr>
+        <w:t>60% of module)</w:t>
       </w:r>
     </w:p>
     <w:p>
@@ -159,33 +195,7 @@
           <w:sz w:val="36"/>
           <w:szCs w:val="36"/>
         </w:rPr>
-        <w:t>[</w:t>
-      </w:r>
-      <w:proofErr w:type="gramStart"/>
-      <w:r>
-        <w:rPr>
-          <w:b/>
-          <w:bCs/>
-          <w:i/>
-          <w:iCs/>
-          <w:color w:val="000000" w:themeColor="text1"/>
-          <w:sz w:val="36"/>
-          <w:szCs w:val="36"/>
-        </w:rPr>
-        <w:t>Your</w:t>
-      </w:r>
-      <w:proofErr w:type="gramEnd"/>
-      <w:r>
-        <w:rPr>
-          <w:b/>
-          <w:bCs/>
-          <w:i/>
-          <w:iCs/>
-          <w:color w:val="000000" w:themeColor="text1"/>
-          <w:sz w:val="36"/>
-          <w:szCs w:val="36"/>
-        </w:rPr>
-        <w:t xml:space="preserve"> Project Title Here]</w:t>
+        <w:t>[Your Project Title Here]</w:t>
       </w:r>
     </w:p>
     <w:p>
@@ -273,18 +283,101 @@
           <w:p>
             <w:pPr>
               <w:rPr>
-                <w:color w:val="000000" w:themeColor="text1"/>
-              </w:rPr>
-            </w:pPr>
-            <w:r>
-              <w:rPr>
                 <w:i/>
                 <w:iCs/>
                 <w:color w:val="000000" w:themeColor="text1"/>
                 <w:sz w:val="22"/>
                 <w:szCs w:val="22"/>
               </w:rPr>
-              <w:t>1. [Full Name — Student ID] 2. [Full Name — Student ID] 3. [Full Name — Student ID] 4. [Full Name — Student ID]</w:t>
+            </w:pPr>
+            <w:r>
+              <w:rPr>
+                <w:i/>
+                <w:iCs/>
+                <w:color w:val="000000" w:themeColor="text1"/>
+                <w:sz w:val="22"/>
+                <w:szCs w:val="22"/>
+              </w:rPr>
+              <w:t>1. [</w:t>
+            </w:r>
+            <w:r>
+              <w:rPr>
+                <w:i/>
+                <w:iCs/>
+                <w:color w:val="000000" w:themeColor="text1"/>
+                <w:sz w:val="22"/>
+                <w:szCs w:val="22"/>
+              </w:rPr>
+              <w:t xml:space="preserve">Abdennouri </w:t>
+            </w:r>
+            <w:proofErr w:type="spellStart"/>
+            <w:r>
+              <w:rPr>
+                <w:i/>
+                <w:iCs/>
+                <w:color w:val="000000" w:themeColor="text1"/>
+                <w:sz w:val="22"/>
+                <w:szCs w:val="22"/>
+              </w:rPr>
+              <w:t>Mouatez</w:t>
+            </w:r>
+            <w:proofErr w:type="spellEnd"/>
+            <w:r>
+              <w:rPr>
+                <w:i/>
+                <w:iCs/>
+                <w:color w:val="000000" w:themeColor="text1"/>
+                <w:sz w:val="22"/>
+                <w:szCs w:val="22"/>
+              </w:rPr>
+              <w:t xml:space="preserve"> Billah</w:t>
+            </w:r>
+            <w:r>
+              <w:rPr>
+                <w:i/>
+                <w:iCs/>
+                <w:color w:val="000000" w:themeColor="text1"/>
+                <w:sz w:val="22"/>
+                <w:szCs w:val="22"/>
+              </w:rPr>
+              <w:t xml:space="preserve"> — </w:t>
+            </w:r>
+            <w:r>
+              <w:rPr>
+                <w:i/>
+                <w:iCs/>
+                <w:color w:val="000000" w:themeColor="text1"/>
+                <w:sz w:val="22"/>
+                <w:szCs w:val="22"/>
+              </w:rPr>
+              <w:t>25016832</w:t>
+            </w:r>
+            <w:r>
+              <w:rPr>
+                <w:i/>
+                <w:iCs/>
+                <w:color w:val="000000" w:themeColor="text1"/>
+                <w:sz w:val="22"/>
+                <w:szCs w:val="22"/>
+              </w:rPr>
+              <w:t>]</w:t>
+            </w:r>
+          </w:p>
+          <w:p>
+            <w:pPr>
+              <w:rPr>
+                <w:color w:val="000000" w:themeColor="text1"/>
+              </w:rPr>
+            </w:pPr>
+            <w:r>
+              <w:rPr>
+                <w:i/>
+                <w:iCs/>
+                <w:color w:val="000000" w:themeColor="text1"/>
+                <w:sz w:val="22"/>
+                <w:szCs w:val="22"/>
+              </w:rPr>
+              <w:t>2. [Full Name — Student ID] 3. [Full Name — Student ID] 4. [Full Name — Student ID]</w:t>
             </w:r>
           </w:p>
         </w:tc>
@@ -1038,7 +1131,6 @@
                 <w:color w:val="000000" w:themeColor="text1"/>
               </w:rPr>
             </w:pPr>
-            <w:proofErr w:type="gramStart"/>
             <w:r>
               <w:rPr>
                 <w:i/>
@@ -1047,18 +1139,7 @@
                 <w:sz w:val="20"/>
                 <w:szCs w:val="20"/>
               </w:rPr>
-              <w:t>and</w:t>
-            </w:r>
-            <w:proofErr w:type="gramEnd"/>
-            <w:r>
-              <w:rPr>
-                <w:i/>
-                <w:iCs/>
-                <w:color w:val="000000" w:themeColor="text1"/>
-                <w:sz w:val="20"/>
-                <w:szCs w:val="20"/>
-              </w:rPr>
-              <w:t xml:space="preserve"> select 'Update Field' → 'Update entire table' to auto-generate the TOC.</w:t>
+              <w:t>and select 'Update Field' → 'Update entire table' to auto-generate the TOC.</w:t>
             </w:r>
           </w:p>
           <w:p>
@@ -1097,7 +1178,6 @@
         <w:alias w:val="Table of Contents"/>
         <w:id w:val="1598983745"/>
       </w:sdtPr>
-      <w:sdtEndPr/>
       <w:sdtContent>
         <w:p>
           <w:pPr>
@@ -4303,8 +4383,8 @@
           <w:color w:val="000000" w:themeColor="text1"/>
         </w:rPr>
         <w:sectPr>
-          <w:headerReference w:type="default" r:id="rId7"/>
-          <w:footerReference w:type="default" r:id="rId8"/>
+          <w:headerReference w:type="default" r:id="rId8"/>
+          <w:footerReference w:type="default" r:id="rId9"/>
           <w:pgSz w:w="11906" w:h="16838"/>
           <w:pgMar w:top="1440" w:right="1440" w:bottom="1440" w:left="1440" w:header="708" w:footer="708" w:gutter="0"/>
           <w:cols w:space="720"/>
@@ -4365,9 +4445,45 @@
       </w:pPr>
       <w:r>
         <w:rPr>
+          <w:color w:val="000000" w:themeColor="text1"/>
+        </w:rPr>
+        <w:t>This report represents our project that aims to help switch managing a restaurant from manual pen and paper to a digital program by building a Database and run SQL queries through applying SQL relational models, graph theory and mathematical sets. Key findings indicate that our Database made the management 60% faster and more organized in which we concluded that switching to digital is so much better than using paper and pen especially when it comes to saving the work.</w:t>
+      </w:r>
+    </w:p>
+    <w:p>
+      <w:pPr>
+        <w:spacing w:before="80" w:after="80"/>
+        <w:rPr>
+          <w:color w:val="000000" w:themeColor="text1"/>
+        </w:rPr>
+      </w:pPr>
+    </w:p>
+    <w:p>
+      <w:pPr>
+        <w:spacing w:before="80" w:after="80"/>
+        <w:rPr>
+          <w:color w:val="EE0000"/>
+        </w:rPr>
+      </w:pPr>
+      <w:r>
+        <w:rPr>
+          <w:color w:val="EE0000"/>
+        </w:rPr>
+        <w:t>Example:</w:t>
+      </w:r>
+    </w:p>
+    <w:p>
+      <w:pPr>
+        <w:spacing w:before="80" w:after="80"/>
+        <w:rPr>
+          <w:color w:val="EE0000"/>
+        </w:rPr>
+      </w:pPr>
+      <w:r>
+        <w:rPr>
           <w:i/>
           <w:iCs/>
-          <w:color w:val="000000" w:themeColor="text1"/>
+          <w:color w:val="EE0000"/>
         </w:rPr>
         <w:t>[Briefly summarise: (1) the problem your group investigated, (2) the mathematical or data analytics approach used, (3) the key findings, and (4) the main conclusions or recommendations. This section should be self-contained and readable without prior knowledge of the project.]</w:t>
       </w:r>
@@ -4376,12 +4492,12 @@
       <w:pPr>
         <w:spacing w:before="80" w:after="80"/>
         <w:rPr>
-          <w:color w:val="000000" w:themeColor="text1"/>
-        </w:rPr>
-      </w:pPr>
-      <w:r>
-        <w:rPr>
-          <w:color w:val="000000" w:themeColor="text1"/>
+          <w:color w:val="EE0000"/>
+        </w:rPr>
+      </w:pPr>
+      <w:r>
+        <w:rPr>
+          <w:color w:val="EE0000"/>
         </w:rPr>
         <w:t>This report presents a [mathematical model / data analytics solution] for [problem description]. The group applied [methodology — e.g. linear regression / graph theory / SQL relational model] to [dataset or scenario]. Key findings indicate that [summary of results]. The report concludes that [main recommendation or insight].</w:t>
       </w:r>
@@ -4389,12 +4505,12 @@
     <w:p>
       <w:pPr>
         <w:rPr>
-          <w:color w:val="000000" w:themeColor="text1"/>
-        </w:rPr>
-      </w:pPr>
-      <w:r>
-        <w:rPr>
-          <w:color w:val="000000" w:themeColor="text1"/>
+          <w:color w:val="EE0000"/>
+        </w:rPr>
+      </w:pPr>
+      <w:r>
+        <w:rPr>
+          <w:color w:val="EE0000"/>
         </w:rPr>
         <w:br w:type="page"/>
       </w:r>
@@ -4915,54 +5031,52 @@
         </w:rPr>
         <w:t>define variables and notation].</w:t>
       </w:r>
-      <w:bookmarkStart w:id="12" w:name="_GoBack"/>
+    </w:p>
+    <w:p>
+      <w:pPr>
+        <w:spacing w:before="80" w:after="80"/>
+        <w:rPr>
+          <w:color w:val="000000" w:themeColor="text1"/>
+        </w:rPr>
+      </w:pPr>
+    </w:p>
+    <w:p>
+      <w:pPr>
+        <w:spacing w:before="80" w:after="80"/>
+        <w:rPr>
+          <w:color w:val="000000" w:themeColor="text1"/>
+        </w:rPr>
+      </w:pPr>
+      <w:r>
+        <w:rPr>
+          <w:color w:val="000000" w:themeColor="text1"/>
+        </w:rPr>
+        <w:t>This model was selected because [justification — compare against at least one alternative approach and explain why this one is more appropriate for the problem].</w:t>
+      </w:r>
+    </w:p>
+    <w:p>
+      <w:pPr>
+        <w:spacing w:before="80" w:after="80"/>
+        <w:rPr>
+          <w:color w:val="000000" w:themeColor="text1"/>
+        </w:rPr>
+      </w:pPr>
+    </w:p>
+    <w:p>
+      <w:pPr>
+        <w:pStyle w:val="Heading2"/>
+        <w:rPr>
+          <w:color w:val="000000" w:themeColor="text1"/>
+        </w:rPr>
+      </w:pPr>
+      <w:bookmarkStart w:id="12" w:name="_Toc225926236"/>
+      <w:r>
+        <w:rPr>
+          <w:color w:val="000000" w:themeColor="text1"/>
+        </w:rPr>
+        <w:t>3.3 Statistical or Algorithmic Approach</w:t>
+      </w:r>
       <w:bookmarkEnd w:id="12"/>
-    </w:p>
-    <w:p>
-      <w:pPr>
-        <w:spacing w:before="80" w:after="80"/>
-        <w:rPr>
-          <w:color w:val="000000" w:themeColor="text1"/>
-        </w:rPr>
-      </w:pPr>
-    </w:p>
-    <w:p>
-      <w:pPr>
-        <w:spacing w:before="80" w:after="80"/>
-        <w:rPr>
-          <w:color w:val="000000" w:themeColor="text1"/>
-        </w:rPr>
-      </w:pPr>
-      <w:r>
-        <w:rPr>
-          <w:color w:val="000000" w:themeColor="text1"/>
-        </w:rPr>
-        <w:t>This model was selected because [justification — compare against at least one alternative approach and explain why this one is more appropriate for the problem].</w:t>
-      </w:r>
-    </w:p>
-    <w:p>
-      <w:pPr>
-        <w:spacing w:before="80" w:after="80"/>
-        <w:rPr>
-          <w:color w:val="000000" w:themeColor="text1"/>
-        </w:rPr>
-      </w:pPr>
-    </w:p>
-    <w:p>
-      <w:pPr>
-        <w:pStyle w:val="Heading2"/>
-        <w:rPr>
-          <w:color w:val="000000" w:themeColor="text1"/>
-        </w:rPr>
-      </w:pPr>
-      <w:bookmarkStart w:id="13" w:name="_Toc225926236"/>
-      <w:r>
-        <w:rPr>
-          <w:color w:val="000000" w:themeColor="text1"/>
-        </w:rPr>
-        <w:t>3.3 Statistical or Algorithmic Approach</w:t>
-      </w:r>
-      <w:bookmarkEnd w:id="13"/>
     </w:p>
     <w:p>
       <w:pPr>
@@ -5063,14 +5177,14 @@
           <w:color w:val="000000" w:themeColor="text1"/>
         </w:rPr>
       </w:pPr>
-      <w:bookmarkStart w:id="14" w:name="_Toc225926237"/>
+      <w:bookmarkStart w:id="13" w:name="_Toc225926237"/>
       <w:r>
         <w:rPr>
           <w:color w:val="000000" w:themeColor="text1"/>
         </w:rPr>
         <w:t>3.4 Assumptions and Constraints</w:t>
       </w:r>
-      <w:bookmarkEnd w:id="14"/>
+      <w:bookmarkEnd w:id="13"/>
     </w:p>
     <w:p>
       <w:pPr>
@@ -5123,7 +5237,7 @@
           <w:color w:val="000000" w:themeColor="text1"/>
         </w:rPr>
       </w:pPr>
-      <w:bookmarkStart w:id="15" w:name="_Toc225926238"/>
+      <w:bookmarkStart w:id="14" w:name="_Toc225926238"/>
       <w:r>
         <w:rPr>
           <w:color w:val="000000" w:themeColor="text1"/>
@@ -5131,7 +5245,7 @@
         <w:lastRenderedPageBreak/>
         <w:t>4. Implementation Approach</w:t>
       </w:r>
-      <w:bookmarkEnd w:id="15"/>
+      <w:bookmarkEnd w:id="14"/>
     </w:p>
     <w:p>
       <w:pPr>
@@ -5167,14 +5281,14 @@
           <w:color w:val="000000" w:themeColor="text1"/>
         </w:rPr>
       </w:pPr>
-      <w:bookmarkStart w:id="16" w:name="_Toc225926239"/>
+      <w:bookmarkStart w:id="15" w:name="_Toc225926239"/>
       <w:r>
         <w:rPr>
           <w:color w:val="000000" w:themeColor="text1"/>
         </w:rPr>
         <w:t>4.1 Tools and Technologies</w:t>
       </w:r>
-      <w:bookmarkEnd w:id="16"/>
+      <w:bookmarkEnd w:id="15"/>
     </w:p>
     <w:p>
       <w:pPr>
@@ -5221,21 +5335,7 @@
         <w:rPr>
           <w:color w:val="000000" w:themeColor="text1"/>
         </w:rPr>
-        <w:t xml:space="preserve">[Library 1 — e.g. </w:t>
-      </w:r>
-      <w:proofErr w:type="spellStart"/>
-      <w:r>
-        <w:rPr>
-          <w:color w:val="000000" w:themeColor="text1"/>
-        </w:rPr>
-        <w:t>NumPy</w:t>
-      </w:r>
-      <w:proofErr w:type="spellEnd"/>
-      <w:r>
-        <w:rPr>
-          <w:color w:val="000000" w:themeColor="text1"/>
-        </w:rPr>
-        <w:t xml:space="preserve"> v1.24 — for numerical computation]</w:t>
+        <w:t>[Library 1 — e.g. NumPy v1.24 — for numerical computation]</w:t>
       </w:r>
     </w:p>
     <w:p>
@@ -5271,35 +5371,7 @@
         <w:rPr>
           <w:color w:val="000000" w:themeColor="text1"/>
         </w:rPr>
-        <w:t xml:space="preserve">[Library 3 — e.g. </w:t>
-      </w:r>
-      <w:proofErr w:type="spellStart"/>
-      <w:r>
-        <w:rPr>
-          <w:color w:val="000000" w:themeColor="text1"/>
-        </w:rPr>
-        <w:t>Matplotlib</w:t>
-      </w:r>
-      <w:proofErr w:type="spellEnd"/>
-      <w:r>
-        <w:rPr>
-          <w:color w:val="000000" w:themeColor="text1"/>
-        </w:rPr>
-        <w:t xml:space="preserve"> / </w:t>
-      </w:r>
-      <w:proofErr w:type="spellStart"/>
-      <w:r>
-        <w:rPr>
-          <w:color w:val="000000" w:themeColor="text1"/>
-        </w:rPr>
-        <w:t>Seaborn</w:t>
-      </w:r>
-      <w:proofErr w:type="spellEnd"/>
-      <w:r>
-        <w:rPr>
-          <w:color w:val="000000" w:themeColor="text1"/>
-        </w:rPr>
-        <w:t xml:space="preserve"> — for visualisation]</w:t>
+        <w:t>[Library 3 — e.g. Matplotlib / Seaborn — for visualisation]</w:t>
       </w:r>
     </w:p>
     <w:p>
@@ -5317,21 +5389,7 @@
         <w:rPr>
           <w:color w:val="000000" w:themeColor="text1"/>
         </w:rPr>
-        <w:t xml:space="preserve">[Library 4 — e.g. </w:t>
-      </w:r>
-      <w:proofErr w:type="spellStart"/>
-      <w:r>
-        <w:rPr>
-          <w:color w:val="000000" w:themeColor="text1"/>
-        </w:rPr>
-        <w:t>Scikit</w:t>
-      </w:r>
-      <w:proofErr w:type="spellEnd"/>
-      <w:r>
-        <w:rPr>
-          <w:color w:val="000000" w:themeColor="text1"/>
-        </w:rPr>
-        <w:t>-learn — for model fitting and evaluation]</w:t>
+        <w:t>[Library 4 — e.g. Scikit-learn — for model fitting and evaluation]</w:t>
       </w:r>
     </w:p>
     <w:p>
@@ -5363,14 +5421,14 @@
           <w:color w:val="000000" w:themeColor="text1"/>
         </w:rPr>
       </w:pPr>
-      <w:bookmarkStart w:id="17" w:name="_Toc225926240"/>
+      <w:bookmarkStart w:id="16" w:name="_Toc225926240"/>
       <w:r>
         <w:rPr>
           <w:color w:val="000000" w:themeColor="text1"/>
         </w:rPr>
         <w:t>4.2 Data Preparation and Cleaning</w:t>
       </w:r>
-      <w:bookmarkEnd w:id="17"/>
+      <w:bookmarkEnd w:id="16"/>
     </w:p>
     <w:p>
       <w:pPr>
@@ -5485,14 +5543,14 @@
           <w:color w:val="000000" w:themeColor="text1"/>
         </w:rPr>
       </w:pPr>
-      <w:bookmarkStart w:id="18" w:name="_Toc225926241"/>
+      <w:bookmarkStart w:id="17" w:name="_Toc225926241"/>
       <w:r>
         <w:rPr>
           <w:color w:val="000000" w:themeColor="text1"/>
         </w:rPr>
         <w:t>4.3 Code Structure and Design</w:t>
       </w:r>
-      <w:bookmarkEnd w:id="18"/>
+      <w:bookmarkEnd w:id="17"/>
     </w:p>
     <w:p>
       <w:pPr>
@@ -5612,7 +5670,7 @@
           <w:color w:val="000000" w:themeColor="text1"/>
         </w:rPr>
       </w:pPr>
-      <w:bookmarkStart w:id="19" w:name="_Toc225926242"/>
+      <w:bookmarkStart w:id="18" w:name="_Toc225926242"/>
       <w:r>
         <w:rPr>
           <w:color w:val="000000" w:themeColor="text1"/>
@@ -5620,7 +5678,7 @@
         <w:lastRenderedPageBreak/>
         <w:t>5. Results and Analysis</w:t>
       </w:r>
-      <w:bookmarkEnd w:id="19"/>
+      <w:bookmarkEnd w:id="18"/>
     </w:p>
     <w:p>
       <w:pPr>
@@ -5656,14 +5714,14 @@
           <w:color w:val="000000" w:themeColor="text1"/>
         </w:rPr>
       </w:pPr>
-      <w:bookmarkStart w:id="20" w:name="_Toc225926243"/>
+      <w:bookmarkStart w:id="19" w:name="_Toc225926243"/>
       <w:r>
         <w:rPr>
           <w:color w:val="000000" w:themeColor="text1"/>
         </w:rPr>
         <w:t>5.1 Descriptive Statistics</w:t>
       </w:r>
-      <w:bookmarkEnd w:id="20"/>
+      <w:bookmarkEnd w:id="19"/>
     </w:p>
     <w:p>
       <w:pPr>
@@ -5821,7 +5879,6 @@
                 <w:color w:val="000000" w:themeColor="text1"/>
               </w:rPr>
             </w:pPr>
-            <w:proofErr w:type="spellStart"/>
             <w:r>
               <w:rPr>
                 <w:b/>
@@ -5830,18 +5887,7 @@
                 <w:sz w:val="20"/>
                 <w:szCs w:val="20"/>
               </w:rPr>
-              <w:t>Std</w:t>
-            </w:r>
-            <w:proofErr w:type="spellEnd"/>
-            <w:r>
-              <w:rPr>
-                <w:b/>
-                <w:bCs/>
-                <w:color w:val="000000" w:themeColor="text1"/>
-                <w:sz w:val="20"/>
-                <w:szCs w:val="20"/>
-              </w:rPr>
-              <w:t xml:space="preserve"> Dev</w:t>
+              <w:t>Std Dev</w:t>
             </w:r>
           </w:p>
         </w:tc>
@@ -6666,14 +6712,14 @@
           <w:color w:val="000000" w:themeColor="text1"/>
         </w:rPr>
       </w:pPr>
-      <w:bookmarkStart w:id="21" w:name="_Toc225926244"/>
+      <w:bookmarkStart w:id="20" w:name="_Toc225926244"/>
       <w:r>
         <w:rPr>
           <w:color w:val="000000" w:themeColor="text1"/>
         </w:rPr>
         <w:t>5.2 Visual Outputs</w:t>
       </w:r>
-      <w:bookmarkEnd w:id="21"/>
+      <w:bookmarkEnd w:id="20"/>
     </w:p>
     <w:p>
       <w:pPr>
@@ -7284,14 +7330,14 @@
           <w:color w:val="000000" w:themeColor="text1"/>
         </w:rPr>
       </w:pPr>
-      <w:bookmarkStart w:id="22" w:name="_Toc225926245"/>
+      <w:bookmarkStart w:id="21" w:name="_Toc225926245"/>
       <w:r>
         <w:rPr>
           <w:color w:val="000000" w:themeColor="text1"/>
         </w:rPr>
         <w:t>5.3 Model Results and Interpretation</w:t>
       </w:r>
-      <w:bookmarkEnd w:id="22"/>
+      <w:bookmarkEnd w:id="21"/>
     </w:p>
     <w:p>
       <w:pPr>
@@ -7338,14 +7384,14 @@
           <w:color w:val="000000" w:themeColor="text1"/>
         </w:rPr>
       </w:pPr>
-      <w:bookmarkStart w:id="23" w:name="_Toc225926246"/>
+      <w:bookmarkStart w:id="22" w:name="_Toc225926246"/>
       <w:r>
         <w:rPr>
           <w:color w:val="000000" w:themeColor="text1"/>
         </w:rPr>
         <w:t>5.4 Comparison and Evaluation</w:t>
       </w:r>
-      <w:bookmarkEnd w:id="23"/>
+      <w:bookmarkEnd w:id="22"/>
     </w:p>
     <w:p>
       <w:pPr>
@@ -7397,7 +7443,7 @@
           <w:color w:val="000000" w:themeColor="text1"/>
         </w:rPr>
       </w:pPr>
-      <w:bookmarkStart w:id="24" w:name="_Toc225926247"/>
+      <w:bookmarkStart w:id="23" w:name="_Toc225926247"/>
       <w:r>
         <w:rPr>
           <w:color w:val="000000" w:themeColor="text1"/>
@@ -7405,7 +7451,7 @@
         <w:lastRenderedPageBreak/>
         <w:t>6. Ethical Considerations</w:t>
       </w:r>
-      <w:bookmarkEnd w:id="24"/>
+      <w:bookmarkEnd w:id="23"/>
     </w:p>
     <w:p>
       <w:pPr>
@@ -7441,14 +7487,14 @@
           <w:color w:val="000000" w:themeColor="text1"/>
         </w:rPr>
       </w:pPr>
-      <w:bookmarkStart w:id="25" w:name="_Toc225926248"/>
+      <w:bookmarkStart w:id="24" w:name="_Toc225926248"/>
       <w:r>
         <w:rPr>
           <w:color w:val="000000" w:themeColor="text1"/>
         </w:rPr>
         <w:t>6.1 Data Ethics and Privacy</w:t>
       </w:r>
-      <w:bookmarkEnd w:id="25"/>
+      <w:bookmarkEnd w:id="24"/>
     </w:p>
     <w:p>
       <w:pPr>
@@ -7509,14 +7555,14 @@
           <w:color w:val="000000" w:themeColor="text1"/>
         </w:rPr>
       </w:pPr>
-      <w:bookmarkStart w:id="26" w:name="_Toc225926249"/>
+      <w:bookmarkStart w:id="25" w:name="_Toc225926249"/>
       <w:r>
         <w:rPr>
           <w:color w:val="000000" w:themeColor="text1"/>
         </w:rPr>
         <w:t>6.2 AI Tool Use</w:t>
       </w:r>
-      <w:bookmarkEnd w:id="26"/>
+      <w:bookmarkEnd w:id="25"/>
     </w:p>
     <w:p>
       <w:pPr>
@@ -7545,35 +7591,7 @@
         <w:rPr>
           <w:color w:val="000000" w:themeColor="text1"/>
         </w:rPr>
-        <w:t xml:space="preserve">AI tools used during this project: [e.g. </w:t>
-      </w:r>
-      <w:proofErr w:type="spellStart"/>
-      <w:r>
-        <w:rPr>
-          <w:color w:val="000000" w:themeColor="text1"/>
-        </w:rPr>
-        <w:t>ChatGPT</w:t>
-      </w:r>
-      <w:proofErr w:type="spellEnd"/>
-      <w:r>
-        <w:rPr>
-          <w:color w:val="000000" w:themeColor="text1"/>
-        </w:rPr>
-        <w:t xml:space="preserve"> for debugging Python code / GitHub </w:t>
-      </w:r>
-      <w:proofErr w:type="spellStart"/>
-      <w:r>
-        <w:rPr>
-          <w:color w:val="000000" w:themeColor="text1"/>
-        </w:rPr>
-        <w:t>Copilot</w:t>
-      </w:r>
-      <w:proofErr w:type="spellEnd"/>
-      <w:r>
-        <w:rPr>
-          <w:color w:val="000000" w:themeColor="text1"/>
-        </w:rPr>
-        <w:t xml:space="preserve"> for code suggestions]. All AI assistance was used for learning and debugging only — no complete solutions were generated by AI. AI use is documented in the project README.</w:t>
+        <w:t>AI tools used during this project: [e.g. ChatGPT for debugging Python code / GitHub Copilot for code suggestions]. All AI assistance was used for learning and debugging only — no complete solutions were generated by AI. AI use is documented in the project README.</w:t>
       </w:r>
     </w:p>
     <w:p>
@@ -7605,14 +7623,14 @@
           <w:color w:val="000000" w:themeColor="text1"/>
         </w:rPr>
       </w:pPr>
-      <w:bookmarkStart w:id="27" w:name="_Toc225926250"/>
+      <w:bookmarkStart w:id="26" w:name="_Toc225926250"/>
       <w:r>
         <w:rPr>
           <w:color w:val="000000" w:themeColor="text1"/>
         </w:rPr>
         <w:t>6.3 Broader Ethical Implications</w:t>
       </w:r>
-      <w:bookmarkEnd w:id="27"/>
+      <w:bookmarkEnd w:id="26"/>
     </w:p>
     <w:p>
       <w:pPr>
@@ -7664,7 +7682,7 @@
           <w:color w:val="000000" w:themeColor="text1"/>
         </w:rPr>
       </w:pPr>
-      <w:bookmarkStart w:id="28" w:name="_Toc225926251"/>
+      <w:bookmarkStart w:id="27" w:name="_Toc225926251"/>
       <w:r>
         <w:rPr>
           <w:color w:val="000000" w:themeColor="text1"/>
@@ -7672,7 +7690,7 @@
         <w:lastRenderedPageBreak/>
         <w:t>7. Conclusions and Recommendations</w:t>
       </w:r>
-      <w:bookmarkEnd w:id="28"/>
+      <w:bookmarkEnd w:id="27"/>
     </w:p>
     <w:p>
       <w:pPr>
@@ -7708,14 +7726,14 @@
           <w:color w:val="000000" w:themeColor="text1"/>
         </w:rPr>
       </w:pPr>
-      <w:bookmarkStart w:id="29" w:name="_Toc225926252"/>
+      <w:bookmarkStart w:id="28" w:name="_Toc225926252"/>
       <w:r>
         <w:rPr>
           <w:color w:val="000000" w:themeColor="text1"/>
         </w:rPr>
         <w:t>7.1 Summary of Findings</w:t>
       </w:r>
-      <w:bookmarkEnd w:id="29"/>
+      <w:bookmarkEnd w:id="28"/>
     </w:p>
     <w:p>
       <w:pPr>
@@ -7816,28 +7834,14 @@
           <w:color w:val="000000" w:themeColor="text1"/>
         </w:rPr>
       </w:pPr>
-      <w:bookmarkStart w:id="30" w:name="_Toc225926253"/>
-      <w:r>
-        <w:rPr>
-          <w:color w:val="000000" w:themeColor="text1"/>
-        </w:rPr>
-        <w:t xml:space="preserve">7.2 Evaluation </w:t>
-      </w:r>
-      <w:proofErr w:type="gramStart"/>
-      <w:r>
-        <w:rPr>
-          <w:color w:val="000000" w:themeColor="text1"/>
-        </w:rPr>
-        <w:t>Against</w:t>
-      </w:r>
-      <w:proofErr w:type="gramEnd"/>
-      <w:r>
-        <w:rPr>
-          <w:color w:val="000000" w:themeColor="text1"/>
-        </w:rPr>
-        <w:t xml:space="preserve"> Objectives</w:t>
-      </w:r>
-      <w:bookmarkEnd w:id="30"/>
+      <w:bookmarkStart w:id="29" w:name="_Toc225926253"/>
+      <w:r>
+        <w:rPr>
+          <w:color w:val="000000" w:themeColor="text1"/>
+        </w:rPr>
+        <w:t>7.2 Evaluation Against Objectives</w:t>
+      </w:r>
+      <w:bookmarkEnd w:id="29"/>
     </w:p>
     <w:p>
       <w:pPr>
@@ -7912,14 +7916,14 @@
           <w:color w:val="000000" w:themeColor="text1"/>
         </w:rPr>
       </w:pPr>
-      <w:bookmarkStart w:id="31" w:name="_Toc225926254"/>
+      <w:bookmarkStart w:id="30" w:name="_Toc225926254"/>
       <w:r>
         <w:rPr>
           <w:color w:val="000000" w:themeColor="text1"/>
         </w:rPr>
         <w:t>7.3 Limitations</w:t>
       </w:r>
-      <w:bookmarkEnd w:id="31"/>
+      <w:bookmarkEnd w:id="30"/>
     </w:p>
     <w:p>
       <w:pPr>
@@ -7966,14 +7970,14 @@
           <w:color w:val="000000" w:themeColor="text1"/>
         </w:rPr>
       </w:pPr>
-      <w:bookmarkStart w:id="32" w:name="_Toc225926255"/>
+      <w:bookmarkStart w:id="31" w:name="_Toc225926255"/>
       <w:r>
         <w:rPr>
           <w:color w:val="000000" w:themeColor="text1"/>
         </w:rPr>
         <w:t>7.4 Recommendations and Future Work</w:t>
       </w:r>
-      <w:bookmarkEnd w:id="32"/>
+      <w:bookmarkEnd w:id="31"/>
     </w:p>
     <w:p>
       <w:pPr>
@@ -8195,7 +8199,7 @@
           <w:color w:val="000000" w:themeColor="text1"/>
         </w:rPr>
       </w:pPr>
-      <w:bookmarkStart w:id="33" w:name="_Toc225926256"/>
+      <w:bookmarkStart w:id="32" w:name="_Toc225926256"/>
       <w:r>
         <w:rPr>
           <w:color w:val="000000" w:themeColor="text1"/>
@@ -8203,7 +8207,7 @@
         <w:lastRenderedPageBreak/>
         <w:t>8. References</w:t>
       </w:r>
-      <w:bookmarkEnd w:id="33"/>
+      <w:bookmarkEnd w:id="32"/>
     </w:p>
     <w:p>
       <w:pPr>
@@ -8433,19 +8437,11 @@
           <w:color w:val="000000" w:themeColor="text1"/>
         </w:rPr>
       </w:pPr>
-      <w:proofErr w:type="spellStart"/>
-      <w:r>
-        <w:rPr>
-          <w:color w:val="000000" w:themeColor="text1"/>
-        </w:rPr>
-        <w:t>VanderPlas</w:t>
-      </w:r>
-      <w:proofErr w:type="spellEnd"/>
-      <w:r>
-        <w:rPr>
-          <w:color w:val="000000" w:themeColor="text1"/>
-        </w:rPr>
-        <w:t>, J. (2016) Python Data Science Handbook. Sebastopol: O'Reilly Media. Available at: https://jakevdp.github.io/PythonDataScienceHandbook/ (Accessed: 1 June 2026).</w:t>
+      <w:r>
+        <w:rPr>
+          <w:color w:val="000000" w:themeColor="text1"/>
+        </w:rPr>
+        <w:t>VanderPlas, J. (2016) Python Data Science Handbook. Sebastopol: O'Reilly Media. Available at: https://jakevdp.github.io/PythonDataScienceHandbook/ (Accessed: 1 June 2026).</w:t>
       </w:r>
     </w:p>
     <w:p>
@@ -8548,7 +8544,7 @@
           <w:color w:val="000000" w:themeColor="text1"/>
         </w:rPr>
       </w:pPr>
-      <w:bookmarkStart w:id="34" w:name="_Toc225926257"/>
+      <w:bookmarkStart w:id="33" w:name="_Toc225926257"/>
       <w:r>
         <w:rPr>
           <w:color w:val="000000" w:themeColor="text1"/>
@@ -8556,7 +8552,7 @@
         <w:lastRenderedPageBreak/>
         <w:t>Appendix A — Group Contribution Summary</w:t>
       </w:r>
-      <w:bookmarkEnd w:id="34"/>
+      <w:bookmarkEnd w:id="33"/>
     </w:p>
     <w:p>
       <w:pPr>
@@ -9126,6 +9122,7 @@
             <w:pPr>
               <w:rPr>
                 <w:color w:val="000000" w:themeColor="text1"/>
+                <w:lang w:val="fr-FR"/>
               </w:rPr>
             </w:pPr>
             <w:r>
@@ -9135,8 +9132,57 @@
                 <w:color w:val="000000" w:themeColor="text1"/>
                 <w:sz w:val="19"/>
                 <w:szCs w:val="19"/>
-              </w:rPr>
-              <w:t>[e.g. Model implementation, Sections 5 &amp; 7, visualisations 3 &amp; 4]</w:t>
+                <w:lang w:val="fr-FR"/>
+              </w:rPr>
+              <w:t>[</w:t>
+            </w:r>
+            <w:proofErr w:type="gramStart"/>
+            <w:r>
+              <w:rPr>
+                <w:i/>
+                <w:iCs/>
+                <w:color w:val="000000" w:themeColor="text1"/>
+                <w:sz w:val="19"/>
+                <w:szCs w:val="19"/>
+                <w:lang w:val="fr-FR"/>
+              </w:rPr>
+              <w:t>e.g.</w:t>
+            </w:r>
+            <w:proofErr w:type="gramEnd"/>
+            <w:r>
+              <w:rPr>
+                <w:i/>
+                <w:iCs/>
+                <w:color w:val="000000" w:themeColor="text1"/>
+                <w:sz w:val="19"/>
+                <w:szCs w:val="19"/>
+                <w:lang w:val="fr-FR"/>
+              </w:rPr>
+              <w:t xml:space="preserve"> Model </w:t>
+            </w:r>
+            <w:proofErr w:type="spellStart"/>
+            <w:r>
+              <w:rPr>
+                <w:i/>
+                <w:iCs/>
+                <w:color w:val="000000" w:themeColor="text1"/>
+                <w:sz w:val="19"/>
+                <w:szCs w:val="19"/>
+                <w:lang w:val="fr-FR"/>
+              </w:rPr>
+              <w:t>implementation</w:t>
+            </w:r>
+            <w:proofErr w:type="spellEnd"/>
+            <w:r>
+              <w:rPr>
+                <w:i/>
+                <w:iCs/>
+                <w:color w:val="000000" w:themeColor="text1"/>
+                <w:sz w:val="19"/>
+                <w:szCs w:val="19"/>
+                <w:lang w:val="fr-FR"/>
+              </w:rPr>
+              <w:t>, Sections 5 &amp; 7, visualisations 3 &amp; 4]</w:t>
             </w:r>
           </w:p>
         </w:tc>
@@ -9373,7 +9419,7 @@
           <w:color w:val="000000" w:themeColor="text1"/>
         </w:rPr>
       </w:pPr>
-      <w:bookmarkStart w:id="35" w:name="_Toc225926258"/>
+      <w:bookmarkStart w:id="34" w:name="_Toc225926258"/>
       <w:r>
         <w:rPr>
           <w:color w:val="000000" w:themeColor="text1"/>
@@ -9381,7 +9427,7 @@
         <w:lastRenderedPageBreak/>
         <w:t>Appendix B — Individual Reflective Statement</w:t>
       </w:r>
-      <w:bookmarkEnd w:id="35"/>
+      <w:bookmarkEnd w:id="34"/>
     </w:p>
     <w:p>
       <w:pPr>
@@ -9609,14 +9655,14 @@
           <w:color w:val="000000" w:themeColor="text1"/>
         </w:rPr>
       </w:pPr>
-      <w:bookmarkStart w:id="36" w:name="_Toc225926259"/>
+      <w:bookmarkStart w:id="35" w:name="_Toc225926259"/>
       <w:r>
         <w:rPr>
           <w:color w:val="000000" w:themeColor="text1"/>
         </w:rPr>
         <w:t>B.1 Reflective Statement — [Student Name, Student ID]</w:t>
       </w:r>
-      <w:bookmarkEnd w:id="36"/>
+      <w:bookmarkEnd w:id="35"/>
     </w:p>
     <w:p>
       <w:pPr>
@@ -9659,14 +9705,14 @@
         <w:rPr>
           <w:color w:val="000000" w:themeColor="text1"/>
         </w:rPr>
-        <w:t xml:space="preserve">The most significant challenge I encountered was [specific challenge — e.g. 'understanding and implementing the Ordinary Least Squares regression algorithm from first principles, without relying on high-level library abstractions']. I overcame this by [approach — e.g. 'reviewing the module lecture notes on linear algebra, working through the derivation step by step, and cross-checking my implementation against </w:t>
+        <w:t>The most significant challenge I encountered was [specific challenge — e.g. 'understanding and implementing the Ordinary Least Squares regression algorithm from first principles, without relying on high-level library abstractions']. I overcame this by [approach — e.g. 'reviewing the module lecture notes on linear algebra, working through the derivation step by step, and cross-checking my implementation against scikit-</w:t>
       </w:r>
       <w:proofErr w:type="spellStart"/>
       <w:r>
         <w:rPr>
           <w:color w:val="000000" w:themeColor="text1"/>
         </w:rPr>
-        <w:t>scikit-learn's</w:t>
+        <w:t>learn's</w:t>
       </w:r>
       <w:proofErr w:type="spellEnd"/>
       <w:r>
@@ -9752,14 +9798,14 @@
           <w:color w:val="000000" w:themeColor="text1"/>
         </w:rPr>
       </w:pPr>
-      <w:bookmarkStart w:id="37" w:name="_Toc225926260"/>
+      <w:bookmarkStart w:id="36" w:name="_Toc225926260"/>
       <w:r>
         <w:rPr>
           <w:color w:val="000000" w:themeColor="text1"/>
         </w:rPr>
         <w:t>B.2 Reflective Statement — [Student Name, Student ID]</w:t>
       </w:r>
-      <w:bookmarkEnd w:id="37"/>
+      <w:bookmarkEnd w:id="36"/>
     </w:p>
     <w:p>
       <w:pPr>
@@ -9826,14 +9872,14 @@
           <w:color w:val="000000" w:themeColor="text1"/>
         </w:rPr>
       </w:pPr>
-      <w:bookmarkStart w:id="38" w:name="_Toc225926261"/>
+      <w:bookmarkStart w:id="37" w:name="_Toc225926261"/>
       <w:r>
         <w:rPr>
           <w:color w:val="000000" w:themeColor="text1"/>
         </w:rPr>
         <w:t>B.3 Reflective Statement — [Student Name, Student ID]</w:t>
       </w:r>
-      <w:bookmarkEnd w:id="38"/>
+      <w:bookmarkEnd w:id="37"/>
     </w:p>
     <w:p>
       <w:pPr>
@@ -9899,14 +9945,14 @@
           <w:color w:val="000000" w:themeColor="text1"/>
         </w:rPr>
       </w:pPr>
-      <w:bookmarkStart w:id="39" w:name="_Toc225926262"/>
+      <w:bookmarkStart w:id="38" w:name="_Toc225926262"/>
       <w:r>
         <w:rPr>
           <w:color w:val="000000" w:themeColor="text1"/>
         </w:rPr>
         <w:t>B.4 Reflective Statement — [Student Name, Student ID]</w:t>
       </w:r>
-      <w:bookmarkEnd w:id="39"/>
+      <w:bookmarkEnd w:id="38"/>
     </w:p>
     <w:p>
       <w:pPr>
@@ -9939,8 +9985,8 @@
       </w:r>
     </w:p>
     <w:sectPr>
-      <w:headerReference w:type="default" r:id="rId9"/>
-      <w:footerReference w:type="default" r:id="rId10"/>
+      <w:headerReference w:type="default" r:id="rId10"/>
+      <w:footerReference w:type="default" r:id="rId11"/>
       <w:pgSz w:w="11906" w:h="16838"/>
       <w:pgMar w:top="1440" w:right="1440" w:bottom="1440" w:left="1440" w:header="708" w:footer="708" w:gutter="0"/>
       <w:cols w:space="720"/>
@@ -9951,7 +9997,7 @@
 </file>
 
 <file path=word/endnotes.xml><?xml version="1.0" encoding="utf-8"?>
-<w:endnotes xmlns:wpc="http://schemas.microsoft.com/office/word/2010/wordprocessingCanvas" xmlns:cx="http://schemas.microsoft.com/office/drawing/2014/chartex" xmlns:cx1="http://schemas.microsoft.com/office/drawing/2015/9/8/chartex" xmlns:mc="http://schemas.openxmlformats.org/markup-compatibility/2006" xmlns:o="urn:schemas-microsoft-com:office:office" xmlns:r="http://schemas.openxmlformats.org/officeDocument/2006/relationships" xmlns:m="http://schemas.openxmlformats.org/officeDocument/2006/math" xmlns:v="urn:schemas-microsoft-com:vml" xmlns:wp14="http://schemas.microsoft.com/office/word/2010/wordprocessingDrawing" xmlns:wp="http://schemas.openxmlformats.org/drawingml/2006/wordprocessingDrawing" xmlns:w10="urn:schemas-microsoft-com:office:word" xmlns:w="http://schemas.openxmlformats.org/wordprocessingml/2006/main" xmlns:w14="http://schemas.microsoft.com/office/word/2010/wordml" xmlns:w15="http://schemas.microsoft.com/office/word/2012/wordml" xmlns:w16se="http://schemas.microsoft.com/office/word/2015/wordml/symex" xmlns:wpg="http://schemas.microsoft.com/office/word/2010/wordprocessingGroup" xmlns:wpi="http://schemas.microsoft.com/office/word/2010/wordprocessingInk" xmlns:wne="http://schemas.microsoft.com/office/word/2006/wordml" xmlns:wps="http://schemas.microsoft.com/office/word/2010/wordprocessingShape" mc:Ignorable="w14 w15 w16se wp14">
+<w:endnotes xmlns:wpc="http://schemas.microsoft.com/office/word/2010/wordprocessingCanvas" xmlns:cx="http://schemas.microsoft.com/office/drawing/2014/chartex" xmlns:cx1="http://schemas.microsoft.com/office/drawing/2015/9/8/chartex" xmlns:cx2="http://schemas.microsoft.com/office/drawing/2015/10/21/chartex" xmlns:cx3="http://schemas.microsoft.com/office/drawing/2016/5/9/chartex" xmlns:cx4="http://schemas.microsoft.com/office/drawing/2016/5/10/chartex" xmlns:cx5="http://schemas.microsoft.com/office/drawing/2016/5/11/chartex" xmlns:cx6="http://schemas.microsoft.com/office/drawing/2016/5/12/chartex" xmlns:cx7="http://schemas.microsoft.com/office/drawing/2016/5/13/chartex" xmlns:cx8="http://schemas.microsoft.com/office/drawing/2016/5/14/chartex" xmlns:mc="http://schemas.openxmlformats.org/markup-compatibility/2006" xmlns:aink="http://schemas.microsoft.com/office/drawing/2016/ink" xmlns:am3d="http://schemas.microsoft.com/office/drawing/2017/model3d" xmlns:o="urn:schemas-microsoft-com:office:office" xmlns:oel="http://schemas.microsoft.com/office/2019/extlst" xmlns:r="http://schemas.openxmlformats.org/officeDocument/2006/relationships" xmlns:m="http://schemas.openxmlformats.org/officeDocument/2006/math" xmlns:v="urn:schemas-microsoft-com:vml" xmlns:wp14="http://schemas.microsoft.com/office/word/2010/wordprocessingDrawing" xmlns:wp="http://schemas.openxmlformats.org/drawingml/2006/wordprocessingDrawing" xmlns:w10="urn:schemas-microsoft-com:office:word" xmlns:w="http://schemas.openxmlformats.org/wordprocessingml/2006/main" xmlns:w14="http://schemas.microsoft.com/office/word/2010/wordml" xmlns:w15="http://schemas.microsoft.com/office/word/2012/wordml" xmlns:w16cex="http://schemas.microsoft.com/office/word/2018/wordml/cex" xmlns:w16cid="http://schemas.microsoft.com/office/word/2016/wordml/cid" xmlns:w16="http://schemas.microsoft.com/office/word/2018/wordml" xmlns:w16du="http://schemas.microsoft.com/office/word/2023/wordml/word16du" xmlns:w16sdtdh="http://schemas.microsoft.com/office/word/2020/wordml/sdtdatahash" xmlns:w16sdtfl="http://schemas.microsoft.com/office/word/2024/wordml/sdtformatlock" xmlns:w16se="http://schemas.microsoft.com/office/word/2015/wordml/symex" xmlns:wpg="http://schemas.microsoft.com/office/word/2010/wordprocessingGroup" xmlns:wpi="http://schemas.microsoft.com/office/word/2010/wordprocessingInk" xmlns:wne="http://schemas.microsoft.com/office/word/2006/wordml" xmlns:wps="http://schemas.microsoft.com/office/word/2010/wordprocessingShape" mc:Ignorable="w14 w15 w16se w16cid w16 w16cex w16sdtdh w16sdtfl w16du wp14">
   <w:endnote w:type="separator" w:id="-1">
     <w:p>
       <w:r>
@@ -9970,7 +10016,7 @@
 </file>
 
 <file path=word/footer1.xml><?xml version="1.0" encoding="utf-8"?>
-<w:ftr xmlns:wpc="http://schemas.microsoft.com/office/word/2010/wordprocessingCanvas" xmlns:cx="http://schemas.microsoft.com/office/drawing/2014/chartex" xmlns:cx1="http://schemas.microsoft.com/office/drawing/2015/9/8/chartex" xmlns:mc="http://schemas.openxmlformats.org/markup-compatibility/2006" xmlns:o="urn:schemas-microsoft-com:office:office" xmlns:r="http://schemas.openxmlformats.org/officeDocument/2006/relationships" xmlns:m="http://schemas.openxmlformats.org/officeDocument/2006/math" xmlns:v="urn:schemas-microsoft-com:vml" xmlns:wp14="http://schemas.microsoft.com/office/word/2010/wordprocessingDrawing" xmlns:wp="http://schemas.openxmlformats.org/drawingml/2006/wordprocessingDrawing" xmlns:w10="urn:schemas-microsoft-com:office:word" xmlns:w="http://schemas.openxmlformats.org/wordprocessingml/2006/main" xmlns:w14="http://schemas.microsoft.com/office/word/2010/wordml" xmlns:w15="http://schemas.microsoft.com/office/word/2012/wordml" xmlns:w16se="http://schemas.microsoft.com/office/word/2015/wordml/symex" xmlns:wpg="http://schemas.microsoft.com/office/word/2010/wordprocessingGroup" xmlns:wpi="http://schemas.microsoft.com/office/word/2010/wordprocessingInk" xmlns:wne="http://schemas.microsoft.com/office/word/2006/wordml" xmlns:wps="http://schemas.microsoft.com/office/word/2010/wordprocessingShape" mc:Ignorable="w14 w15 w16se wp14">
+<w:ftr xmlns:wpc="http://schemas.microsoft.com/office/word/2010/wordprocessingCanvas" xmlns:cx="http://schemas.microsoft.com/office/drawing/2014/chartex" xmlns:cx1="http://schemas.microsoft.com/office/drawing/2015/9/8/chartex" xmlns:cx2="http://schemas.microsoft.com/office/drawing/2015/10/21/chartex" xmlns:cx3="http://schemas.microsoft.com/office/drawing/2016/5/9/chartex" xmlns:cx4="http://schemas.microsoft.com/office/drawing/2016/5/10/chartex" xmlns:cx5="http://schemas.microsoft.com/office/drawing/2016/5/11/chartex" xmlns:cx6="http://schemas.microsoft.com/office/drawing/2016/5/12/chartex" xmlns:cx7="http://schemas.microsoft.com/office/drawing/2016/5/13/chartex" xmlns:cx8="http://schemas.microsoft.com/office/drawing/2016/5/14/chartex" xmlns:mc="http://schemas.openxmlformats.org/markup-compatibility/2006" xmlns:aink="http://schemas.microsoft.com/office/drawing/2016/ink" xmlns:am3d="http://schemas.microsoft.com/office/drawing/2017/model3d" xmlns:o="urn:schemas-microsoft-com:office:office" xmlns:oel="http://schemas.microsoft.com/office/2019/extlst" xmlns:r="http://schemas.openxmlformats.org/officeDocument/2006/relationships" xmlns:m="http://schemas.openxmlformats.org/officeDocument/2006/math" xmlns:v="urn:schemas-microsoft-com:vml" xmlns:wp14="http://schemas.microsoft.com/office/word/2010/wordprocessingDrawing" xmlns:wp="http://schemas.openxmlformats.org/drawingml/2006/wordprocessingDrawing" xmlns:w10="urn:schemas-microsoft-com:office:word" xmlns:w="http://schemas.openxmlformats.org/wordprocessingml/2006/main" xmlns:w14="http://schemas.microsoft.com/office/word/2010/wordml" xmlns:w15="http://schemas.microsoft.com/office/word/2012/wordml" xmlns:w16cex="http://schemas.microsoft.com/office/word/2018/wordml/cex" xmlns:w16cid="http://schemas.microsoft.com/office/word/2016/wordml/cid" xmlns:w16="http://schemas.microsoft.com/office/word/2018/wordml" xmlns:w16du="http://schemas.microsoft.com/office/word/2023/wordml/word16du" xmlns:w16sdtdh="http://schemas.microsoft.com/office/word/2020/wordml/sdtdatahash" xmlns:w16sdtfl="http://schemas.microsoft.com/office/word/2024/wordml/sdtformatlock" xmlns:w16se="http://schemas.microsoft.com/office/word/2015/wordml/symex" xmlns:wpg="http://schemas.microsoft.com/office/word/2010/wordprocessingGroup" xmlns:wpi="http://schemas.microsoft.com/office/word/2010/wordprocessingInk" xmlns:wne="http://schemas.microsoft.com/office/word/2006/wordml" xmlns:wps="http://schemas.microsoft.com/office/word/2010/wordprocessingShape" mc:Ignorable="w14 w15 w16se w16cid w16 w16cex w16sdtdh w16sdtfl w16du wp14">
   <w:p>
     <w:pPr>
       <w:pBdr>
@@ -10081,7 +10127,7 @@
 </file>
 
 <file path=word/footer2.xml><?xml version="1.0" encoding="utf-8"?>
-<w:ftr xmlns:wpc="http://schemas.microsoft.com/office/word/2010/wordprocessingCanvas" xmlns:cx="http://schemas.microsoft.com/office/drawing/2014/chartex" xmlns:cx1="http://schemas.microsoft.com/office/drawing/2015/9/8/chartex" xmlns:mc="http://schemas.openxmlformats.org/markup-compatibility/2006" xmlns:o="urn:schemas-microsoft-com:office:office" xmlns:r="http://schemas.openxmlformats.org/officeDocument/2006/relationships" xmlns:m="http://schemas.openxmlformats.org/officeDocument/2006/math" xmlns:v="urn:schemas-microsoft-com:vml" xmlns:wp14="http://schemas.microsoft.com/office/word/2010/wordprocessingDrawing" xmlns:wp="http://schemas.openxmlformats.org/drawingml/2006/wordprocessingDrawing" xmlns:w10="urn:schemas-microsoft-com:office:word" xmlns:w="http://schemas.openxmlformats.org/wordprocessingml/2006/main" xmlns:w14="http://schemas.microsoft.com/office/word/2010/wordml" xmlns:w15="http://schemas.microsoft.com/office/word/2012/wordml" xmlns:w16se="http://schemas.microsoft.com/office/word/2015/wordml/symex" xmlns:wpg="http://schemas.microsoft.com/office/word/2010/wordprocessingGroup" xmlns:wpi="http://schemas.microsoft.com/office/word/2010/wordprocessingInk" xmlns:wne="http://schemas.microsoft.com/office/word/2006/wordml" xmlns:wps="http://schemas.microsoft.com/office/word/2010/wordprocessingShape" mc:Ignorable="w14 w15 w16se wp14">
+<w:ftr xmlns:wpc="http://schemas.microsoft.com/office/word/2010/wordprocessingCanvas" xmlns:cx="http://schemas.microsoft.com/office/drawing/2014/chartex" xmlns:cx1="http://schemas.microsoft.com/office/drawing/2015/9/8/chartex" xmlns:cx2="http://schemas.microsoft.com/office/drawing/2015/10/21/chartex" xmlns:cx3="http://schemas.microsoft.com/office/drawing/2016/5/9/chartex" xmlns:cx4="http://schemas.microsoft.com/office/drawing/2016/5/10/chartex" xmlns:cx5="http://schemas.microsoft.com/office/drawing/2016/5/11/chartex" xmlns:cx6="http://schemas.microsoft.com/office/drawing/2016/5/12/chartex" xmlns:cx7="http://schemas.microsoft.com/office/drawing/2016/5/13/chartex" xmlns:cx8="http://schemas.microsoft.com/office/drawing/2016/5/14/chartex" xmlns:mc="http://schemas.openxmlformats.org/markup-compatibility/2006" xmlns:aink="http://schemas.microsoft.com/office/drawing/2016/ink" xmlns:am3d="http://schemas.microsoft.com/office/drawing/2017/model3d" xmlns:o="urn:schemas-microsoft-com:office:office" xmlns:oel="http://schemas.microsoft.com/office/2019/extlst" xmlns:r="http://schemas.openxmlformats.org/officeDocument/2006/relationships" xmlns:m="http://schemas.openxmlformats.org/officeDocument/2006/math" xmlns:v="urn:schemas-microsoft-com:vml" xmlns:wp14="http://schemas.microsoft.com/office/word/2010/wordprocessingDrawing" xmlns:wp="http://schemas.openxmlformats.org/drawingml/2006/wordprocessingDrawing" xmlns:w10="urn:schemas-microsoft-com:office:word" xmlns:w="http://schemas.openxmlformats.org/wordprocessingml/2006/main" xmlns:w14="http://schemas.microsoft.com/office/word/2010/wordml" xmlns:w15="http://schemas.microsoft.com/office/word/2012/wordml" xmlns:w16cex="http://schemas.microsoft.com/office/word/2018/wordml/cex" xmlns:w16cid="http://schemas.microsoft.com/office/word/2016/wordml/cid" xmlns:w16="http://schemas.microsoft.com/office/word/2018/wordml" xmlns:w16du="http://schemas.microsoft.com/office/word/2023/wordml/word16du" xmlns:w16sdtdh="http://schemas.microsoft.com/office/word/2020/wordml/sdtdatahash" xmlns:w16sdtfl="http://schemas.microsoft.com/office/word/2024/wordml/sdtformatlock" xmlns:w16se="http://schemas.microsoft.com/office/word/2015/wordml/symex" xmlns:wpg="http://schemas.microsoft.com/office/word/2010/wordprocessingGroup" xmlns:wpi="http://schemas.microsoft.com/office/word/2010/wordprocessingInk" xmlns:wne="http://schemas.microsoft.com/office/word/2006/wordml" xmlns:wps="http://schemas.microsoft.com/office/word/2010/wordprocessingShape" mc:Ignorable="w14 w15 w16se w16cid w16 w16cex w16sdtdh w16sdtfl w16du wp14">
   <w:p>
     <w:pPr>
       <w:pBdr>
@@ -10192,7 +10238,7 @@
 </file>
 
 <file path=word/footnotes.xml><?xml version="1.0" encoding="utf-8"?>
-<w:footnotes xmlns:wpc="http://schemas.microsoft.com/office/word/2010/wordprocessingCanvas" xmlns:cx="http://schemas.microsoft.com/office/drawing/2014/chartex" xmlns:cx1="http://schemas.microsoft.com/office/drawing/2015/9/8/chartex" xmlns:mc="http://schemas.openxmlformats.org/markup-compatibility/2006" xmlns:o="urn:schemas-microsoft-com:office:office" xmlns:r="http://schemas.openxmlformats.org/officeDocument/2006/relationships" xmlns:m="http://schemas.openxmlformats.org/officeDocument/2006/math" xmlns:v="urn:schemas-microsoft-com:vml" xmlns:wp14="http://schemas.microsoft.com/office/word/2010/wordprocessingDrawing" xmlns:wp="http://schemas.openxmlformats.org/drawingml/2006/wordprocessingDrawing" xmlns:w10="urn:schemas-microsoft-com:office:word" xmlns:w="http://schemas.openxmlformats.org/wordprocessingml/2006/main" xmlns:w14="http://schemas.microsoft.com/office/word/2010/wordml" xmlns:w15="http://schemas.microsoft.com/office/word/2012/wordml" xmlns:w16se="http://schemas.microsoft.com/office/word/2015/wordml/symex" xmlns:wpg="http://schemas.microsoft.com/office/word/2010/wordprocessingGroup" xmlns:wpi="http://schemas.microsoft.com/office/word/2010/wordprocessingInk" xmlns:wne="http://schemas.microsoft.com/office/word/2006/wordml" xmlns:wps="http://schemas.microsoft.com/office/word/2010/wordprocessingShape" mc:Ignorable="w14 w15 w16se wp14">
+<w:footnotes xmlns:wpc="http://schemas.microsoft.com/office/word/2010/wordprocessingCanvas" xmlns:cx="http://schemas.microsoft.com/office/drawing/2014/chartex" xmlns:cx1="http://schemas.microsoft.com/office/drawing/2015/9/8/chartex" xmlns:cx2="http://schemas.microsoft.com/office/drawing/2015/10/21/chartex" xmlns:cx3="http://schemas.microsoft.com/office/drawing/2016/5/9/chartex" xmlns:cx4="http://schemas.microsoft.com/office/drawing/2016/5/10/chartex" xmlns:cx5="http://schemas.microsoft.com/office/drawing/2016/5/11/chartex" xmlns:cx6="http://schemas.microsoft.com/office/drawing/2016/5/12/chartex" xmlns:cx7="http://schemas.microsoft.com/office/drawing/2016/5/13/chartex" xmlns:cx8="http://schemas.microsoft.com/office/drawing/2016/5/14/chartex" xmlns:mc="http://schemas.openxmlformats.org/markup-compatibility/2006" xmlns:aink="http://schemas.microsoft.com/office/drawing/2016/ink" xmlns:am3d="http://schemas.microsoft.com/office/drawing/2017/model3d" xmlns:o="urn:schemas-microsoft-com:office:office" xmlns:oel="http://schemas.microsoft.com/office/2019/extlst" xmlns:r="http://schemas.openxmlformats.org/officeDocument/2006/relationships" xmlns:m="http://schemas.openxmlformats.org/officeDocument/2006/math" xmlns:v="urn:schemas-microsoft-com:vml" xmlns:wp14="http://schemas.microsoft.com/office/word/2010/wordprocessingDrawing" xmlns:wp="http://schemas.openxmlformats.org/drawingml/2006/wordprocessingDrawing" xmlns:w10="urn:schemas-microsoft-com:office:word" xmlns:w="http://schemas.openxmlformats.org/wordprocessingml/2006/main" xmlns:w14="http://schemas.microsoft.com/office/word/2010/wordml" xmlns:w15="http://schemas.microsoft.com/office/word/2012/wordml" xmlns:w16cex="http://schemas.microsoft.com/office/word/2018/wordml/cex" xmlns:w16cid="http://schemas.microsoft.com/office/word/2016/wordml/cid" xmlns:w16="http://schemas.microsoft.com/office/word/2018/wordml" xmlns:w16du="http://schemas.microsoft.com/office/word/2023/wordml/word16du" xmlns:w16sdtdh="http://schemas.microsoft.com/office/word/2020/wordml/sdtdatahash" xmlns:w16sdtfl="http://schemas.microsoft.com/office/word/2024/wordml/sdtformatlock" xmlns:w16se="http://schemas.microsoft.com/office/word/2015/wordml/symex" xmlns:wpg="http://schemas.microsoft.com/office/word/2010/wordprocessingGroup" xmlns:wpi="http://schemas.microsoft.com/office/word/2010/wordprocessingInk" xmlns:wne="http://schemas.microsoft.com/office/word/2006/wordml" xmlns:wps="http://schemas.microsoft.com/office/word/2010/wordprocessingShape" mc:Ignorable="w14 w15 w16se w16cid w16 w16cex w16sdtdh w16sdtfl w16du wp14">
   <w:footnote w:type="separator" w:id="-1">
     <w:p>
       <w:r>
@@ -10211,7 +10257,7 @@
 </file>
 
 <file path=word/header1.xml><?xml version="1.0" encoding="utf-8"?>
-<w:hdr xmlns:wpc="http://schemas.microsoft.com/office/word/2010/wordprocessingCanvas" xmlns:cx="http://schemas.microsoft.com/office/drawing/2014/chartex" xmlns:cx1="http://schemas.microsoft.com/office/drawing/2015/9/8/chartex" xmlns:mc="http://schemas.openxmlformats.org/markup-compatibility/2006" xmlns:o="urn:schemas-microsoft-com:office:office" xmlns:r="http://schemas.openxmlformats.org/officeDocument/2006/relationships" xmlns:m="http://schemas.openxmlformats.org/officeDocument/2006/math" xmlns:v="urn:schemas-microsoft-com:vml" xmlns:wp14="http://schemas.microsoft.com/office/word/2010/wordprocessingDrawing" xmlns:wp="http://schemas.openxmlformats.org/drawingml/2006/wordprocessingDrawing" xmlns:w10="urn:schemas-microsoft-com:office:word" xmlns:w="http://schemas.openxmlformats.org/wordprocessingml/2006/main" xmlns:w14="http://schemas.microsoft.com/office/word/2010/wordml" xmlns:w15="http://schemas.microsoft.com/office/word/2012/wordml" xmlns:w16se="http://schemas.microsoft.com/office/word/2015/wordml/symex" xmlns:wpg="http://schemas.microsoft.com/office/word/2010/wordprocessingGroup" xmlns:wpi="http://schemas.microsoft.com/office/word/2010/wordprocessingInk" xmlns:wne="http://schemas.microsoft.com/office/word/2006/wordml" xmlns:wps="http://schemas.microsoft.com/office/word/2010/wordprocessingShape" mc:Ignorable="w14 w15 w16se wp14">
+<w:hdr xmlns:wpc="http://schemas.microsoft.com/office/word/2010/wordprocessingCanvas" xmlns:cx="http://schemas.microsoft.com/office/drawing/2014/chartex" xmlns:cx1="http://schemas.microsoft.com/office/drawing/2015/9/8/chartex" xmlns:cx2="http://schemas.microsoft.com/office/drawing/2015/10/21/chartex" xmlns:cx3="http://schemas.microsoft.com/office/drawing/2016/5/9/chartex" xmlns:cx4="http://schemas.microsoft.com/office/drawing/2016/5/10/chartex" xmlns:cx5="http://schemas.microsoft.com/office/drawing/2016/5/11/chartex" xmlns:cx6="http://schemas.microsoft.com/office/drawing/2016/5/12/chartex" xmlns:cx7="http://schemas.microsoft.com/office/drawing/2016/5/13/chartex" xmlns:cx8="http://schemas.microsoft.com/office/drawing/2016/5/14/chartex" xmlns:mc="http://schemas.openxmlformats.org/markup-compatibility/2006" xmlns:aink="http://schemas.microsoft.com/office/drawing/2016/ink" xmlns:am3d="http://schemas.microsoft.com/office/drawing/2017/model3d" xmlns:o="urn:schemas-microsoft-com:office:office" xmlns:oel="http://schemas.microsoft.com/office/2019/extlst" xmlns:r="http://schemas.openxmlformats.org/officeDocument/2006/relationships" xmlns:m="http://schemas.openxmlformats.org/officeDocument/2006/math" xmlns:v="urn:schemas-microsoft-com:vml" xmlns:wp14="http://schemas.microsoft.com/office/word/2010/wordprocessingDrawing" xmlns:wp="http://schemas.openxmlformats.org/drawingml/2006/wordprocessingDrawing" xmlns:w10="urn:schemas-microsoft-com:office:word" xmlns:w="http://schemas.openxmlformats.org/wordprocessingml/2006/main" xmlns:w14="http://schemas.microsoft.com/office/word/2010/wordml" xmlns:w15="http://schemas.microsoft.com/office/word/2012/wordml" xmlns:w16cex="http://schemas.microsoft.com/office/word/2018/wordml/cex" xmlns:w16cid="http://schemas.microsoft.com/office/word/2016/wordml/cid" xmlns:w16="http://schemas.microsoft.com/office/word/2018/wordml" xmlns:w16du="http://schemas.microsoft.com/office/word/2023/wordml/word16du" xmlns:w16sdtdh="http://schemas.microsoft.com/office/word/2020/wordml/sdtdatahash" xmlns:w16sdtfl="http://schemas.microsoft.com/office/word/2024/wordml/sdtformatlock" xmlns:w16se="http://schemas.microsoft.com/office/word/2015/wordml/symex" xmlns:wpg="http://schemas.microsoft.com/office/word/2010/wordprocessingGroup" xmlns:wpi="http://schemas.microsoft.com/office/word/2010/wordprocessingInk" xmlns:wne="http://schemas.microsoft.com/office/word/2006/wordml" xmlns:wps="http://schemas.microsoft.com/office/word/2010/wordprocessingShape" mc:Ignorable="w14 w15 w16se w16cid w16 w16cex w16sdtdh w16sdtfl w16du wp14">
   <w:p>
     <w:pPr>
       <w:pBdr>
@@ -10224,7 +10270,7 @@
         <w:sz w:val="18"/>
         <w:szCs w:val="18"/>
       </w:rPr>
-      <w:t>M-</w:t>
+      <w:t>M-CSC005U</w:t>
     </w:r>
     <w:proofErr w:type="gramStart"/>
     <w:r>
@@ -10233,7 +10279,7 @@
         <w:sz w:val="18"/>
         <w:szCs w:val="18"/>
       </w:rPr>
-      <w:t>CSC005U1  —</w:t>
+      <w:t>1  —</w:t>
     </w:r>
     <w:proofErr w:type="gramEnd"/>
     <w:r>
@@ -10249,7 +10295,7 @@
 </file>
 
 <file path=word/header2.xml><?xml version="1.0" encoding="utf-8"?>
-<w:hdr xmlns:wpc="http://schemas.microsoft.com/office/word/2010/wordprocessingCanvas" xmlns:cx="http://schemas.microsoft.com/office/drawing/2014/chartex" xmlns:cx1="http://schemas.microsoft.com/office/drawing/2015/9/8/chartex" xmlns:mc="http://schemas.openxmlformats.org/markup-compatibility/2006" xmlns:o="urn:schemas-microsoft-com:office:office" xmlns:r="http://schemas.openxmlformats.org/officeDocument/2006/relationships" xmlns:m="http://schemas.openxmlformats.org/officeDocument/2006/math" xmlns:v="urn:schemas-microsoft-com:vml" xmlns:wp14="http://schemas.microsoft.com/office/word/2010/wordprocessingDrawing" xmlns:wp="http://schemas.openxmlformats.org/drawingml/2006/wordprocessingDrawing" xmlns:w10="urn:schemas-microsoft-com:office:word" xmlns:w="http://schemas.openxmlformats.org/wordprocessingml/2006/main" xmlns:w14="http://schemas.microsoft.com/office/word/2010/wordml" xmlns:w15="http://schemas.microsoft.com/office/word/2012/wordml" xmlns:w16se="http://schemas.microsoft.com/office/word/2015/wordml/symex" xmlns:wpg="http://schemas.microsoft.com/office/word/2010/wordprocessingGroup" xmlns:wpi="http://schemas.microsoft.com/office/word/2010/wordprocessingInk" xmlns:wne="http://schemas.microsoft.com/office/word/2006/wordml" xmlns:wps="http://schemas.microsoft.com/office/word/2010/wordprocessingShape" mc:Ignorable="w14 w15 w16se wp14">
+<w:hdr xmlns:wpc="http://schemas.microsoft.com/office/word/2010/wordprocessingCanvas" xmlns:cx="http://schemas.microsoft.com/office/drawing/2014/chartex" xmlns:cx1="http://schemas.microsoft.com/office/drawing/2015/9/8/chartex" xmlns:cx2="http://schemas.microsoft.com/office/drawing/2015/10/21/chartex" xmlns:cx3="http://schemas.microsoft.com/office/drawing/2016/5/9/chartex" xmlns:cx4="http://schemas.microsoft.com/office/drawing/2016/5/10/chartex" xmlns:cx5="http://schemas.microsoft.com/office/drawing/2016/5/11/chartex" xmlns:cx6="http://schemas.microsoft.com/office/drawing/2016/5/12/chartex" xmlns:cx7="http://schemas.microsoft.com/office/drawing/2016/5/13/chartex" xmlns:cx8="http://schemas.microsoft.com/office/drawing/2016/5/14/chartex" xmlns:mc="http://schemas.openxmlformats.org/markup-compatibility/2006" xmlns:aink="http://schemas.microsoft.com/office/drawing/2016/ink" xmlns:am3d="http://schemas.microsoft.com/office/drawing/2017/model3d" xmlns:o="urn:schemas-microsoft-com:office:office" xmlns:oel="http://schemas.microsoft.com/office/2019/extlst" xmlns:r="http://schemas.openxmlformats.org/officeDocument/2006/relationships" xmlns:m="http://schemas.openxmlformats.org/officeDocument/2006/math" xmlns:v="urn:schemas-microsoft-com:vml" xmlns:wp14="http://schemas.microsoft.com/office/word/2010/wordprocessingDrawing" xmlns:wp="http://schemas.openxmlformats.org/drawingml/2006/wordprocessingDrawing" xmlns:w10="urn:schemas-microsoft-com:office:word" xmlns:w="http://schemas.openxmlformats.org/wordprocessingml/2006/main" xmlns:w14="http://schemas.microsoft.com/office/word/2010/wordml" xmlns:w15="http://schemas.microsoft.com/office/word/2012/wordml" xmlns:w16cex="http://schemas.microsoft.com/office/word/2018/wordml/cex" xmlns:w16cid="http://schemas.microsoft.com/office/word/2016/wordml/cid" xmlns:w16="http://schemas.microsoft.com/office/word/2018/wordml" xmlns:w16du="http://schemas.microsoft.com/office/word/2023/wordml/word16du" xmlns:w16sdtdh="http://schemas.microsoft.com/office/word/2020/wordml/sdtdatahash" xmlns:w16sdtfl="http://schemas.microsoft.com/office/word/2024/wordml/sdtformatlock" xmlns:w16se="http://schemas.microsoft.com/office/word/2015/wordml/symex" xmlns:wpg="http://schemas.microsoft.com/office/word/2010/wordprocessingGroup" xmlns:wpi="http://schemas.microsoft.com/office/word/2010/wordprocessingInk" xmlns:wne="http://schemas.microsoft.com/office/word/2006/wordml" xmlns:wps="http://schemas.microsoft.com/office/word/2010/wordprocessingShape" mc:Ignorable="w14 w15 w16se w16cid w16 w16cex w16sdtdh w16sdtfl w16du wp14">
   <w:p>
     <w:pPr>
       <w:pBdr>
@@ -10262,7 +10308,7 @@
         <w:sz w:val="18"/>
         <w:szCs w:val="18"/>
       </w:rPr>
-      <w:t>M-</w:t>
+      <w:t>M-CSC005U</w:t>
     </w:r>
     <w:proofErr w:type="gramStart"/>
     <w:r>
@@ -10271,7 +10317,7 @@
         <w:sz w:val="18"/>
         <w:szCs w:val="18"/>
       </w:rPr>
-      <w:t>CSC005U1  —</w:t>
+      <w:t>1  —</w:t>
     </w:r>
     <w:proofErr w:type="gramEnd"/>
     <w:r>
@@ -10287,7 +10333,7 @@
 </file>
 
 <file path=word/numbering.xml><?xml version="1.0" encoding="utf-8"?>
-<w:numbering xmlns:wpc="http://schemas.microsoft.com/office/word/2010/wordprocessingCanvas" xmlns:cx="http://schemas.microsoft.com/office/drawing/2014/chartex" xmlns:cx1="http://schemas.microsoft.com/office/drawing/2015/9/8/chartex" xmlns:mc="http://schemas.openxmlformats.org/markup-compatibility/2006" xmlns:o="urn:schemas-microsoft-com:office:office" xmlns:r="http://schemas.openxmlformats.org/officeDocument/2006/relationships" xmlns:m="http://schemas.openxmlformats.org/officeDocument/2006/math" xmlns:v="urn:schemas-microsoft-com:vml" xmlns:wp14="http://schemas.microsoft.com/office/word/2010/wordprocessingDrawing" xmlns:wp="http://schemas.openxmlformats.org/drawingml/2006/wordprocessingDrawing" xmlns:w10="urn:schemas-microsoft-com:office:word" xmlns:w="http://schemas.openxmlformats.org/wordprocessingml/2006/main" xmlns:w14="http://schemas.microsoft.com/office/word/2010/wordml" xmlns:w15="http://schemas.microsoft.com/office/word/2012/wordml" xmlns:w16se="http://schemas.microsoft.com/office/word/2015/wordml/symex" xmlns:wpg="http://schemas.microsoft.com/office/word/2010/wordprocessingGroup" xmlns:wpi="http://schemas.microsoft.com/office/word/2010/wordprocessingInk" xmlns:wne="http://schemas.microsoft.com/office/word/2006/wordml" xmlns:wps="http://schemas.microsoft.com/office/word/2010/wordprocessingShape" mc:Ignorable="w14 w15 w16se wp14">
+<w:numbering xmlns:wpc="http://schemas.microsoft.com/office/word/2010/wordprocessingCanvas" xmlns:cx="http://schemas.microsoft.com/office/drawing/2014/chartex" xmlns:cx1="http://schemas.microsoft.com/office/drawing/2015/9/8/chartex" xmlns:cx2="http://schemas.microsoft.com/office/drawing/2015/10/21/chartex" xmlns:cx3="http://schemas.microsoft.com/office/drawing/2016/5/9/chartex" xmlns:cx4="http://schemas.microsoft.com/office/drawing/2016/5/10/chartex" xmlns:cx5="http://schemas.microsoft.com/office/drawing/2016/5/11/chartex" xmlns:cx6="http://schemas.microsoft.com/office/drawing/2016/5/12/chartex" xmlns:cx7="http://schemas.microsoft.com/office/drawing/2016/5/13/chartex" xmlns:cx8="http://schemas.microsoft.com/office/drawing/2016/5/14/chartex" xmlns:mc="http://schemas.openxmlformats.org/markup-compatibility/2006" xmlns:aink="http://schemas.microsoft.com/office/drawing/2016/ink" xmlns:am3d="http://schemas.microsoft.com/office/drawing/2017/model3d" xmlns:o="urn:schemas-microsoft-com:office:office" xmlns:oel="http://schemas.microsoft.com/office/2019/extlst" xmlns:r="http://schemas.openxmlformats.org/officeDocument/2006/relationships" xmlns:m="http://schemas.openxmlformats.org/officeDocument/2006/math" xmlns:v="urn:schemas-microsoft-com:vml" xmlns:wp14="http://schemas.microsoft.com/office/word/2010/wordprocessingDrawing" xmlns:wp="http://schemas.openxmlformats.org/drawingml/2006/wordprocessingDrawing" xmlns:w10="urn:schemas-microsoft-com:office:word" xmlns:w="http://schemas.openxmlformats.org/wordprocessingml/2006/main" xmlns:w14="http://schemas.microsoft.com/office/word/2010/wordml" xmlns:w15="http://schemas.microsoft.com/office/word/2012/wordml" xmlns:w16cex="http://schemas.microsoft.com/office/word/2018/wordml/cex" xmlns:w16cid="http://schemas.microsoft.com/office/word/2016/wordml/cid" xmlns:w16="http://schemas.microsoft.com/office/word/2018/wordml" xmlns:w16du="http://schemas.microsoft.com/office/word/2023/wordml/word16du" xmlns:w16sdtdh="http://schemas.microsoft.com/office/word/2020/wordml/sdtdatahash" xmlns:w16sdtfl="http://schemas.microsoft.com/office/word/2024/wordml/sdtformatlock" xmlns:w16se="http://schemas.microsoft.com/office/word/2015/wordml/symex" xmlns:wpg="http://schemas.microsoft.com/office/word/2010/wordprocessingGroup" xmlns:wpi="http://schemas.microsoft.com/office/word/2010/wordprocessingInk" xmlns:wne="http://schemas.microsoft.com/office/word/2006/wordml" xmlns:wps="http://schemas.microsoft.com/office/word/2010/wordprocessingShape" mc:Ignorable="w14 w15 w16se w16cid w16 w16cex w16sdtdh w16sdtfl w16du wp14">
   <w:abstractNum w:abstractNumId="0" w15:restartNumberingAfterBreak="0">
     <w:nsid w:val="1A9C0F8A"/>
     <w:multiLevelType w:val="hybridMultilevel"/>
@@ -10482,19 +10528,19 @@
       <w:lvlJc w:val="left"/>
     </w:lvl>
   </w:abstractNum>
-  <w:num w:numId="1">
+  <w:num w:numId="1" w16cid:durableId="1998995251">
     <w:abstractNumId w:val="1"/>
     <w:lvlOverride w:ilvl="0">
       <w:startOverride w:val="1"/>
     </w:lvlOverride>
   </w:num>
-  <w:num w:numId="2">
+  <w:num w:numId="2" w16cid:durableId="279647338">
     <w:abstractNumId w:val="0"/>
     <w:lvlOverride w:ilvl="0">
       <w:startOverride w:val="1"/>
     </w:lvlOverride>
   </w:num>
-  <w:num w:numId="3">
+  <w:num w:numId="3" w16cid:durableId="1483737891">
     <w:abstractNumId w:val="2"/>
     <w:lvlOverride w:ilvl="0">
       <w:startOverride w:val="1"/>
@@ -10504,7 +10550,7 @@
 </file>
 
 <file path=word/styles.xml><?xml version="1.0" encoding="utf-8"?>
-<w:styles xmlns:mc="http://schemas.openxmlformats.org/markup-compatibility/2006" xmlns:r="http://schemas.openxmlformats.org/officeDocument/2006/relationships" xmlns:w="http://schemas.openxmlformats.org/wordprocessingml/2006/main" xmlns:w14="http://schemas.microsoft.com/office/word/2010/wordml" xmlns:w15="http://schemas.microsoft.com/office/word/2012/wordml" xmlns:w16se="http://schemas.microsoft.com/office/word/2015/wordml/symex" mc:Ignorable="w14 w15 w16se">
+<w:styles xmlns:mc="http://schemas.openxmlformats.org/markup-compatibility/2006" xmlns:r="http://schemas.openxmlformats.org/officeDocument/2006/relationships" xmlns:w="http://schemas.openxmlformats.org/wordprocessingml/2006/main" xmlns:w14="http://schemas.microsoft.com/office/word/2010/wordml" xmlns:w15="http://schemas.microsoft.com/office/word/2012/wordml" xmlns:w16cex="http://schemas.microsoft.com/office/word/2018/wordml/cex" xmlns:w16cid="http://schemas.microsoft.com/office/word/2016/wordml/cid" xmlns:w16="http://schemas.microsoft.com/office/word/2018/wordml" xmlns:w16du="http://schemas.microsoft.com/office/word/2023/wordml/word16du" xmlns:w16sdtdh="http://schemas.microsoft.com/office/word/2020/wordml/sdtdatahash" xmlns:w16sdtfl="http://schemas.microsoft.com/office/word/2024/wordml/sdtformatlock" xmlns:w16se="http://schemas.microsoft.com/office/word/2015/wordml/symex" mc:Ignorable="w14 w15 w16se w16cid w16 w16cex w16sdtdh w16sdtfl w16du">
   <w:docDefaults>
     <w:rPrDefault>
       <w:rPr>
@@ -10517,7 +10563,7 @@
     </w:rPrDefault>
     <w:pPrDefault/>
   </w:docDefaults>
-  <w:latentStyles w:defLockedState="0" w:defUIPriority="99" w:defSemiHidden="0" w:defUnhideWhenUsed="0" w:defQFormat="0" w:count="371">
+  <w:latentStyles w:defLockedState="0" w:defUIPriority="99" w:defSemiHidden="0" w:defUnhideWhenUsed="0" w:defQFormat="0" w:count="376">
     <w:lsdException w:name="Normal" w:uiPriority="0" w:qFormat="1"/>
     <w:lsdException w:name="heading 1" w:uiPriority="9" w:qFormat="1"/>
     <w:lsdException w:name="heading 2" w:semiHidden="1" w:uiPriority="9" w:unhideWhenUsed="1" w:qFormat="1"/>
@@ -10889,6 +10935,11 @@
     <w:lsdException w:name="List Table 5 Dark Accent 6" w:uiPriority="50"/>
     <w:lsdException w:name="List Table 6 Colorful Accent 6" w:uiPriority="51"/>
     <w:lsdException w:name="List Table 7 Colorful Accent 6" w:uiPriority="52"/>
+    <w:lsdException w:name="Mention" w:semiHidden="1" w:unhideWhenUsed="1"/>
+    <w:lsdException w:name="Smart Hyperlink" w:semiHidden="1" w:unhideWhenUsed="1"/>
+    <w:lsdException w:name="Hashtag" w:semiHidden="1" w:unhideWhenUsed="1"/>
+    <w:lsdException w:name="Unresolved Mention" w:semiHidden="1" w:unhideWhenUsed="1"/>
+    <w:lsdException w:name="Smart Link" w:semiHidden="1" w:unhideWhenUsed="1"/>
   </w:latentStyles>
   <w:style w:type="paragraph" w:default="1" w:styleId="Normal">
     <w:name w:val="Normal"/>
@@ -11343,4 +11394,16 @@
     </a:ext>
   </a:extLst>
 </a:theme>
+</file>
+
+<file path=customXml/item1.xml><?xml version="1.0" encoding="utf-8"?>
+<b:Sources xmlns:b="http://schemas.openxmlformats.org/officeDocument/2006/bibliography" xmlns="http://schemas.openxmlformats.org/officeDocument/2006/bibliography" SelectedStyle="\APASixthEditionOfficeOnline.xsl" StyleName="APA" Version="6"/>
+</file>
+
+<file path=customXml/itemProps1.xml><?xml version="1.0" encoding="utf-8"?>
+<ds:datastoreItem xmlns:ds="http://schemas.openxmlformats.org/officeDocument/2006/customXml" ds:itemID="{11CE9064-0015-4BAE-B6CA-558D0B4F112B}">
+  <ds:schemaRefs>
+    <ds:schemaRef ds:uri="http://schemas.openxmlformats.org/officeDocument/2006/bibliography"/>
+  </ds:schemaRefs>
+</ds:datastoreItem>
 </file>
</xml_diff>

<commit_message>
added section 3-5, fixed section 2
</commit_message>
<xml_diff>
--- a/M-CSC005U1 Group Project Template.docx
+++ b/M-CSC005U1 Group Project Template.docx
@@ -5719,22 +5719,6 @@
         <w:t>4.2 Data Preparation and Cleaning</w:t>
       </w:r>
       <w:bookmarkEnd w:id="15"/>
-    </w:p>
-    <w:p>
-      <w:pPr>
-        <w:spacing w:before="80" w:after="80"/>
-        <w:rPr>
-          <w:color w:val="000000" w:themeColor="text1"/>
-        </w:rPr>
-      </w:pPr>
-      <w:r>
-        <w:rPr>
-          <w:i/>
-          <w:iCs/>
-          <w:color w:val="000000" w:themeColor="text1"/>
-        </w:rPr>
-        <w:t>[Describe how you prepared and cleaned the data before analysis. Document any transformations applied.]</w:t>
-      </w:r>
     </w:p>
     <w:p>
       <w:pPr>

</xml_diff>

<commit_message>
Update M-CSC005U1 Group Project Template.docx
</commit_message>
<xml_diff>
--- a/M-CSC005U1 Group Project Template.docx
+++ b/M-CSC005U1 Group Project Template.docx
@@ -4456,33 +4456,6 @@
     </w:p>
     <w:p>
       <w:pPr>
-        <w:spacing w:before="40" w:after="40"/>
-        <w:ind w:left="360"/>
-        <w:rPr>
-          <w:color w:val="000000" w:themeColor="text1"/>
-        </w:rPr>
-      </w:pPr>
-      <w:r>
-        <w:rPr>
-          <w:i/>
-          <w:iCs/>
-          <w:color w:val="000000" w:themeColor="text1"/>
-          <w:sz w:val="20"/>
-          <w:szCs w:val="20"/>
-        </w:rPr>
-        <w:t>Tip: Target: ~300–400 words. Define the problem clearly, explain its real-world relevance, and state your project objectives.</w:t>
-      </w:r>
-    </w:p>
-    <w:p>
-      <w:pPr>
-        <w:spacing w:before="80" w:after="80"/>
-        <w:rPr>
-          <w:color w:val="000000" w:themeColor="text1"/>
-        </w:rPr>
-      </w:pPr>
-    </w:p>
-    <w:p>
-      <w:pPr>
         <w:pStyle w:val="Heading2"/>
         <w:rPr>
           <w:color w:val="000000" w:themeColor="text1"/>
@@ -5274,18 +5247,15 @@
           <w:color w:val="000000" w:themeColor="text1"/>
         </w:rPr>
         <w:lastRenderedPageBreak/>
-        <w:t>4. Implementation Approach</w:t>
+        <w:t>4. Implementation Approac</w:t>
       </w:r>
       <w:bookmarkEnd w:id="14"/>
-    </w:p>
-    <w:p>
-      <w:pPr>
-        <w:spacing w:before="40" w:after="40"/>
-        <w:ind w:left="360"/>
-        <w:rPr>
-          <w:color w:val="000000" w:themeColor="text1"/>
-        </w:rPr>
-      </w:pPr>
+      <w:r>
+        <w:rPr>
+          <w:color w:val="000000" w:themeColor="text1"/>
+        </w:rPr>
+        <w:t>h</w:t>
+      </w:r>
       <w:r>
         <w:rPr>
           <w:i/>
@@ -5294,16 +5264,8 @@
           <w:sz w:val="20"/>
           <w:szCs w:val="20"/>
         </w:rPr>
-        <w:t>Tip: Target: ~400–500 words. Describe your code, tools, and data preparation. Reference your GitHub repository or code submission.</w:t>
-      </w:r>
-    </w:p>
-    <w:p>
-      <w:pPr>
-        <w:spacing w:before="80" w:after="80"/>
-        <w:rPr>
-          <w:color w:val="000000" w:themeColor="text1"/>
-        </w:rPr>
-      </w:pPr>
+        <w:t>.</w:t>
+      </w:r>
     </w:p>
     <w:p>
       <w:pPr>
@@ -5967,7 +5929,6 @@
         <w:rPr>
           <w:color w:val="000000" w:themeColor="text1"/>
         </w:rPr>
-        <w:lastRenderedPageBreak/>
         <w:t>The code is structured into the following modules / scripts:</w:t>
       </w:r>
     </w:p>
@@ -6022,6 +5983,7 @@
         <w:rPr>
           <w:color w:val="000000" w:themeColor="text1"/>
         </w:rPr>
+        <w:lastRenderedPageBreak/>
         <w:t>[File 3 — e.g. visualisation.py — generates all charts and graphs]</w:t>
       </w:r>
     </w:p>
@@ -8330,6 +8292,155 @@
     </w:p>
     <w:p>
       <w:pPr>
+        <w:spacing w:before="80" w:after="80"/>
+        <w:rPr>
+          <w:color w:val="000000" w:themeColor="text1"/>
+        </w:rPr>
+      </w:pPr>
+      <w:r>
+        <w:rPr>
+          <w:color w:val="000000" w:themeColor="text1"/>
+        </w:rPr>
+        <w:t xml:space="preserve">Objective 1 </w:t>
+      </w:r>
+    </w:p>
+    <w:p>
+      <w:pPr>
+        <w:pStyle w:val="ListParagraph"/>
+        <w:numPr>
+          <w:ilvl w:val="0"/>
+          <w:numId w:val="5"/>
+        </w:numPr>
+        <w:spacing w:before="80" w:after="80"/>
+        <w:rPr>
+          <w:color w:val="000000" w:themeColor="text1"/>
+        </w:rPr>
+      </w:pPr>
+      <w:r>
+        <w:rPr>
+          <w:color w:val="000000" w:themeColor="text1"/>
+        </w:rPr>
+        <w:t xml:space="preserve">objective 1 </w:t>
+      </w:r>
+      <w:r>
+        <w:rPr>
+          <w:color w:val="000000" w:themeColor="text1"/>
+        </w:rPr>
+        <w:t>–</w:t>
+      </w:r>
+      <w:r>
+        <w:rPr>
+          <w:color w:val="000000" w:themeColor="text1"/>
+        </w:rPr>
+        <w:t xml:space="preserve"> Designing</w:t>
+      </w:r>
+      <w:r>
+        <w:rPr>
+          <w:color w:val="000000" w:themeColor="text1"/>
+        </w:rPr>
+        <w:t xml:space="preserve"> a relatable database management system </w:t>
+      </w:r>
+    </w:p>
+    <w:p>
+      <w:pPr>
+        <w:pStyle w:val="ListParagraph"/>
+        <w:numPr>
+          <w:ilvl w:val="0"/>
+          <w:numId w:val="5"/>
+        </w:numPr>
+        <w:spacing w:before="80" w:after="80"/>
+        <w:rPr>
+          <w:color w:val="000000" w:themeColor="text1"/>
+        </w:rPr>
+      </w:pPr>
+      <w:r>
+        <w:rPr>
+          <w:color w:val="000000" w:themeColor="text1"/>
+        </w:rPr>
+        <w:t>objective2 – implementation of the solution using phpMyAdmin and MySQL</w:t>
+      </w:r>
+    </w:p>
+    <w:p>
+      <w:pPr>
+        <w:pStyle w:val="ListParagraph"/>
+        <w:numPr>
+          <w:ilvl w:val="0"/>
+          <w:numId w:val="5"/>
+        </w:numPr>
+        <w:spacing w:before="80" w:after="80"/>
+        <w:rPr>
+          <w:color w:val="000000" w:themeColor="text1"/>
+        </w:rPr>
+      </w:pPr>
+      <w:r>
+        <w:rPr>
+          <w:color w:val="000000" w:themeColor="text1"/>
+        </w:rPr>
+        <w:t xml:space="preserve">objective 3 – database population </w:t>
+      </w:r>
+    </w:p>
+    <w:p>
+      <w:pPr>
+        <w:pStyle w:val="ListParagraph"/>
+        <w:numPr>
+          <w:ilvl w:val="0"/>
+          <w:numId w:val="5"/>
+        </w:numPr>
+        <w:spacing w:before="80" w:after="80"/>
+        <w:rPr>
+          <w:color w:val="000000" w:themeColor="text1"/>
+        </w:rPr>
+      </w:pPr>
+      <w:r>
+        <w:rPr>
+          <w:color w:val="000000" w:themeColor="text1"/>
+        </w:rPr>
+        <w:t xml:space="preserve">objective 4 - Querry and data analysis with the use of MySQL, python and pandas </w:t>
+      </w:r>
+      <w:r>
+        <w:rPr>
+          <w:color w:val="000000" w:themeColor="text1"/>
+        </w:rPr>
+        <w:t xml:space="preserve"> </w:t>
+      </w:r>
+    </w:p>
+    <w:p>
+      <w:pPr>
+        <w:pStyle w:val="ListParagraph"/>
+        <w:numPr>
+          <w:ilvl w:val="0"/>
+          <w:numId w:val="5"/>
+        </w:numPr>
+        <w:spacing w:before="80" w:after="80"/>
+        <w:rPr>
+          <w:color w:val="000000" w:themeColor="text1"/>
+        </w:rPr>
+      </w:pPr>
+      <w:r>
+        <w:rPr>
+          <w:color w:val="000000" w:themeColor="text1"/>
+        </w:rPr>
+        <w:t>objective 5 – visualization using matplotlib</w:t>
+      </w:r>
+    </w:p>
+    <w:p>
+      <w:pPr>
+        <w:spacing w:before="80" w:after="80"/>
+        <w:rPr>
+          <w:color w:val="000000" w:themeColor="text1"/>
+        </w:rPr>
+      </w:pPr>
+    </w:p>
+    <w:p>
+      <w:pPr>
+        <w:spacing w:before="80" w:after="80"/>
+        <w:rPr>
+          <w:color w:val="000000" w:themeColor="text1"/>
+        </w:rPr>
+      </w:pPr>
+    </w:p>
+    <w:p>
+      <w:pPr>
         <w:pStyle w:val="Heading2"/>
         <w:rPr>
           <w:color w:val="000000" w:themeColor="text1"/>
@@ -8425,6 +8536,7 @@
         <w:rPr>
           <w:color w:val="000000" w:themeColor="text1"/>
         </w:rPr>
+        <w:lastRenderedPageBreak/>
         <w:t>Based on these findings, the following recommendations are made: [list practical, evidence-based recommendations]. Future work could extend this project by [e.g. applying the model to a larger dataset, implementing a more sophisticated algorithm, integrating the solution with a live database system].</w:t>
       </w:r>
     </w:p>
@@ -10837,6 +10949,95 @@
     </w:lvl>
   </w:abstractNum>
   <w:abstractNum w:abstractNumId="2" w15:restartNumberingAfterBreak="0">
+    <w:nsid w:val="386B175F"/>
+    <w:multiLevelType w:val="hybridMultilevel"/>
+    <w:tmpl w:val="75DAC08A"/>
+    <w:lvl w:ilvl="0" w:tplc="FFFFFFFF">
+      <w:start w:val="1"/>
+      <w:numFmt w:val="decimal"/>
+      <w:lvlText w:val="%1."/>
+      <w:lvlJc w:val="left"/>
+      <w:pPr>
+        <w:ind w:left="720" w:hanging="360"/>
+      </w:pPr>
+      <w:rPr>
+        <w:rFonts w:hint="default"/>
+      </w:rPr>
+    </w:lvl>
+    <w:lvl w:ilvl="1" w:tplc="FFFFFFFF" w:tentative="1">
+      <w:start w:val="1"/>
+      <w:numFmt w:val="lowerLetter"/>
+      <w:lvlText w:val="%2."/>
+      <w:lvlJc w:val="left"/>
+      <w:pPr>
+        <w:ind w:left="1440" w:hanging="360"/>
+      </w:pPr>
+    </w:lvl>
+    <w:lvl w:ilvl="2" w:tplc="FFFFFFFF" w:tentative="1">
+      <w:start w:val="1"/>
+      <w:numFmt w:val="lowerRoman"/>
+      <w:lvlText w:val="%3."/>
+      <w:lvlJc w:val="right"/>
+      <w:pPr>
+        <w:ind w:left="2160" w:hanging="180"/>
+      </w:pPr>
+    </w:lvl>
+    <w:lvl w:ilvl="3" w:tplc="FFFFFFFF" w:tentative="1">
+      <w:start w:val="1"/>
+      <w:numFmt w:val="decimal"/>
+      <w:lvlText w:val="%4."/>
+      <w:lvlJc w:val="left"/>
+      <w:pPr>
+        <w:ind w:left="2880" w:hanging="360"/>
+      </w:pPr>
+    </w:lvl>
+    <w:lvl w:ilvl="4" w:tplc="FFFFFFFF" w:tentative="1">
+      <w:start w:val="1"/>
+      <w:numFmt w:val="lowerLetter"/>
+      <w:lvlText w:val="%5."/>
+      <w:lvlJc w:val="left"/>
+      <w:pPr>
+        <w:ind w:left="3600" w:hanging="360"/>
+      </w:pPr>
+    </w:lvl>
+    <w:lvl w:ilvl="5" w:tplc="FFFFFFFF" w:tentative="1">
+      <w:start w:val="1"/>
+      <w:numFmt w:val="lowerRoman"/>
+      <w:lvlText w:val="%6."/>
+      <w:lvlJc w:val="right"/>
+      <w:pPr>
+        <w:ind w:left="4320" w:hanging="180"/>
+      </w:pPr>
+    </w:lvl>
+    <w:lvl w:ilvl="6" w:tplc="FFFFFFFF" w:tentative="1">
+      <w:start w:val="1"/>
+      <w:numFmt w:val="decimal"/>
+      <w:lvlText w:val="%7."/>
+      <w:lvlJc w:val="left"/>
+      <w:pPr>
+        <w:ind w:left="5040" w:hanging="360"/>
+      </w:pPr>
+    </w:lvl>
+    <w:lvl w:ilvl="7" w:tplc="FFFFFFFF" w:tentative="1">
+      <w:start w:val="1"/>
+      <w:numFmt w:val="lowerLetter"/>
+      <w:lvlText w:val="%8."/>
+      <w:lvlJc w:val="left"/>
+      <w:pPr>
+        <w:ind w:left="5760" w:hanging="360"/>
+      </w:pPr>
+    </w:lvl>
+    <w:lvl w:ilvl="8" w:tplc="FFFFFFFF" w:tentative="1">
+      <w:start w:val="1"/>
+      <w:numFmt w:val="lowerRoman"/>
+      <w:lvlText w:val="%9."/>
+      <w:lvlJc w:val="right"/>
+      <w:pPr>
+        <w:ind w:left="6480" w:hanging="180"/>
+      </w:pPr>
+    </w:lvl>
+  </w:abstractNum>
+  <w:abstractNum w:abstractNumId="3" w15:restartNumberingAfterBreak="0">
     <w:nsid w:val="49840A01"/>
     <w:multiLevelType w:val="hybridMultilevel"/>
     <w:tmpl w:val="DC72C29E"/>
@@ -10922,7 +11123,7 @@
       </w:pPr>
     </w:lvl>
   </w:abstractNum>
-  <w:abstractNum w:abstractNumId="3" w15:restartNumberingAfterBreak="0">
+  <w:abstractNum w:abstractNumId="4" w15:restartNumberingAfterBreak="0">
     <w:nsid w:val="6871742C"/>
     <w:multiLevelType w:val="hybridMultilevel"/>
     <w:tmpl w:val="0302C5A0"/>
@@ -10977,7 +11178,7 @@
     </w:lvl>
   </w:abstractNum>
   <w:num w:numId="1" w16cid:durableId="1998995251">
-    <w:abstractNumId w:val="2"/>
+    <w:abstractNumId w:val="3"/>
     <w:lvlOverride w:ilvl="0">
       <w:startOverride w:val="1"/>
     </w:lvlOverride>
@@ -10989,13 +11190,16 @@
     </w:lvlOverride>
   </w:num>
   <w:num w:numId="3" w16cid:durableId="1483737891">
-    <w:abstractNumId w:val="3"/>
+    <w:abstractNumId w:val="4"/>
     <w:lvlOverride w:ilvl="0">
       <w:startOverride w:val="1"/>
     </w:lvlOverride>
   </w:num>
   <w:num w:numId="4" w16cid:durableId="670761327">
     <w:abstractNumId w:val="1"/>
+  </w:num>
+  <w:num w:numId="5" w16cid:durableId="1445228719">
+    <w:abstractNumId w:val="2"/>
   </w:num>
 </w:numbering>
 </file>

</xml_diff>